<commit_message>
update 092925 cancel test
</commit_message>
<xml_diff>
--- a/customer service/speech therapist/speech-therapist-config-v5.docx
+++ b/customer service/speech therapist/speech-therapist-config-v5.docx
@@ -5320,45 +5320,57 @@
           <w:szCs w:val="22"/>
         </w:rPr>
       </w:pPr>
-      <w:r>
+    </w:p>
+    <w:p>
+      <w:pPr>
+        <w:ind w:left="720"/>
         <w:rPr>
           <w:sz w:val="22"/>
           <w:szCs w:val="22"/>
         </w:rPr>
-        <w:t>Enable &amp; reload:</w:t>
-      </w:r>
+      </w:pPr>
     </w:p>
     <w:p>
       <w:pPr>
         <w:ind w:left="720"/>
         <w:rPr>
+          <w:b/>
+          <w:bCs/>
+          <w:i/>
+          <w:iCs/>
           <w:sz w:val="22"/>
           <w:szCs w:val="22"/>
-        </w:rPr>
-      </w:pPr>
-      <w:proofErr w:type="spellStart"/>
-      <w:r>
-        <w:rPr>
+          <w:u w:val="single"/>
+        </w:rPr>
+      </w:pPr>
+      <w:r>
+        <w:rPr>
+          <w:b/>
+          <w:bCs/>
+          <w:i/>
+          <w:iCs/>
           <w:sz w:val="22"/>
           <w:szCs w:val="22"/>
-        </w:rPr>
-        <w:t>sudo</w:t>
-      </w:r>
-      <w:proofErr w:type="spellEnd"/>
-      <w:r>
+          <w:u w:val="single"/>
+        </w:rPr>
+        <w:t>Enable &amp; reload:</w:t>
+      </w:r>
+    </w:p>
+    <w:p>
+      <w:pPr>
+        <w:ind w:left="720"/>
         <w:rPr>
           <w:sz w:val="22"/>
           <w:szCs w:val="22"/>
         </w:rPr>
-        <w:t xml:space="preserve"> ln -s /etc/nginx/sites-available/funlearning4u.com /</w:t>
-      </w:r>
+      </w:pPr>
       <w:proofErr w:type="spellStart"/>
       <w:r>
         <w:rPr>
           <w:sz w:val="22"/>
           <w:szCs w:val="22"/>
         </w:rPr>
-        <w:t>etc</w:t>
+        <w:t>sudo</w:t>
       </w:r>
       <w:proofErr w:type="spellEnd"/>
       <w:r>
@@ -5366,89 +5378,119 @@
           <w:sz w:val="22"/>
           <w:szCs w:val="22"/>
         </w:rPr>
-        <w:t>/nginx/sites-enabled/</w:t>
-      </w:r>
-    </w:p>
-    <w:p>
-      <w:pPr>
-        <w:ind w:left="720"/>
+        <w:t xml:space="preserve"> ln -s /etc/nginx/sites-available/funlearning4u.com </w:t>
+      </w:r>
+      <w:r>
         <w:rPr>
           <w:sz w:val="22"/>
           <w:szCs w:val="22"/>
         </w:rPr>
-      </w:pPr>
-      <w:proofErr w:type="spellStart"/>
+        <w:t xml:space="preserve">       </w:t>
+      </w:r>
       <w:r>
         <w:rPr>
           <w:sz w:val="22"/>
           <w:szCs w:val="22"/>
         </w:rPr>
-        <w:t>sudo</w:t>
-      </w:r>
-      <w:proofErr w:type="spellEnd"/>
+        <w:t>/</w:t>
+      </w:r>
+      <w:proofErr w:type="spellStart"/>
       <w:r>
         <w:rPr>
           <w:sz w:val="22"/>
           <w:szCs w:val="22"/>
         </w:rPr>
-        <w:t xml:space="preserve"> nginx -t</w:t>
-      </w:r>
-    </w:p>
-    <w:p>
-      <w:pPr>
-        <w:ind w:left="720"/>
+        <w:t>etc</w:t>
+      </w:r>
+      <w:proofErr w:type="spellEnd"/>
+      <w:r>
         <w:rPr>
           <w:sz w:val="22"/>
           <w:szCs w:val="22"/>
         </w:rPr>
-      </w:pPr>
-      <w:proofErr w:type="spellStart"/>
-      <w:r>
+        <w:t>/nginx/sites-enabled/</w:t>
+      </w:r>
+    </w:p>
+    <w:p>
+      <w:pPr>
+        <w:ind w:left="720"/>
         <w:rPr>
           <w:sz w:val="22"/>
           <w:szCs w:val="22"/>
         </w:rPr>
-        <w:t>sudo</w:t>
-      </w:r>
-      <w:proofErr w:type="spellEnd"/>
+      </w:pPr>
+      <w:proofErr w:type="spellStart"/>
       <w:r>
         <w:rPr>
           <w:sz w:val="22"/>
           <w:szCs w:val="22"/>
         </w:rPr>
-        <w:t xml:space="preserve"> </w:t>
-      </w:r>
-      <w:proofErr w:type="spellStart"/>
+        <w:t>sudo</w:t>
+      </w:r>
+      <w:proofErr w:type="spellEnd"/>
       <w:r>
         <w:rPr>
           <w:sz w:val="22"/>
           <w:szCs w:val="22"/>
         </w:rPr>
-        <w:t>systemctl</w:t>
-      </w:r>
-      <w:proofErr w:type="spellEnd"/>
-      <w:r>
+        <w:t xml:space="preserve"> nginx -t</w:t>
+      </w:r>
+    </w:p>
+    <w:p>
+      <w:pPr>
+        <w:ind w:left="720"/>
         <w:rPr>
           <w:sz w:val="22"/>
           <w:szCs w:val="22"/>
         </w:rPr>
-        <w:t xml:space="preserve"> reload nginx</w:t>
-      </w:r>
-    </w:p>
-    <w:p>
-      <w:pPr>
+      </w:pPr>
+      <w:proofErr w:type="spellStart"/>
+      <w:r>
         <w:rPr>
           <w:sz w:val="22"/>
           <w:szCs w:val="22"/>
         </w:rPr>
-      </w:pPr>
+        <w:t>sudo</w:t>
+      </w:r>
+      <w:proofErr w:type="spellEnd"/>
       <w:r>
         <w:rPr>
           <w:sz w:val="22"/>
           <w:szCs w:val="22"/>
         </w:rPr>
+        <w:t xml:space="preserve"> </w:t>
+      </w:r>
+      <w:proofErr w:type="spellStart"/>
+      <w:r>
+        <w:rPr>
+          <w:sz w:val="22"/>
+          <w:szCs w:val="22"/>
+        </w:rPr>
+        <w:t>systemctl</w:t>
+      </w:r>
+      <w:proofErr w:type="spellEnd"/>
+      <w:r>
+        <w:rPr>
+          <w:sz w:val="22"/>
+          <w:szCs w:val="22"/>
+        </w:rPr>
+        <w:t xml:space="preserve"> reload nginx</w:t>
+      </w:r>
+    </w:p>
+    <w:p>
+      <w:pPr>
+        <w:rPr>
+          <w:sz w:val="22"/>
+          <w:szCs w:val="22"/>
+        </w:rPr>
+      </w:pPr>
+      <w:r>
+        <w:rPr>
+          <w:sz w:val="22"/>
+          <w:szCs w:val="22"/>
+        </w:rPr>
         <w:pict w14:anchorId="45E56EF0">
-          <v:rect id="_x0000_i1137" style="width:468pt;height:.85pt" o:hralign="center" o:hrstd="t" o:hr="t" fillcolor="#a0a0a0" stroked="f"/>
+          <v:rect id="_x0000_i1025" style="width:468pt;height:.85pt" o:hralign="center" o:hrstd="t" o:hr="t" fillcolor="#a0a0a0" stroked="f"/>
         </w:pict>
       </w:r>
     </w:p>
@@ -5563,7 +5605,7 @@
           <w:szCs w:val="22"/>
         </w:rPr>
         <w:pict w14:anchorId="0DDDB665">
-          <v:rect id="_x0000_i1138" style="width:6in;height:.85pt" o:hralign="center" o:hrstd="t" o:hr="t" fillcolor="#a0a0a0" stroked="f"/>
+          <v:rect id="_x0000_i1026" style="width:6in;height:.85pt" o:hralign="center" o:hrstd="t" o:hr="t" fillcolor="#a0a0a0" stroked="f"/>
         </w:pict>
       </w:r>
     </w:p>
@@ -5966,6 +6008,7 @@
           <w:sz w:val="22"/>
           <w:szCs w:val="22"/>
         </w:rPr>
+        <w:lastRenderedPageBreak/>
         <w:t xml:space="preserve">    </w:t>
       </w:r>
       <w:proofErr w:type="spellStart"/>
@@ -6064,7 +6107,6 @@
           <w:sz w:val="22"/>
           <w:szCs w:val="22"/>
         </w:rPr>
-        <w:lastRenderedPageBreak/>
         <w:t xml:space="preserve">    location / {</w:t>
       </w:r>
     </w:p>
@@ -6784,6 +6826,7 @@
           <w:sz w:val="22"/>
           <w:szCs w:val="22"/>
         </w:rPr>
+        <w:lastRenderedPageBreak/>
         <w:t>User=ubuntu</w:t>
       </w:r>
     </w:p>
@@ -6826,7 +6869,6 @@
           <w:sz w:val="22"/>
           <w:szCs w:val="22"/>
         </w:rPr>
-        <w:lastRenderedPageBreak/>
         <w:t>ExecStart</w:t>
       </w:r>
       <w:proofErr w:type="spellEnd"/>
@@ -7360,6 +7402,9 @@
         </mc:AlternateContent>
       </w:r>
       <w:r>
+        <w:rPr>
+          <w:noProof/>
+        </w:rPr>
         <w:drawing>
           <wp:inline distT="0" distB="0" distL="0" distR="0" wp14:anchorId="6576260B" wp14:editId="5BA806A8">
             <wp:extent cx="5943600" cy="1805940"/>
@@ -7615,6 +7660,9 @@
         </mc:AlternateContent>
       </w:r>
       <w:r>
+        <w:rPr>
+          <w:noProof/>
+        </w:rPr>
         <w:drawing>
           <wp:inline distT="0" distB="0" distL="0" distR="0" wp14:anchorId="34915CFB" wp14:editId="40217152">
             <wp:extent cx="5943600" cy="2752725"/>
@@ -7756,6 +7804,9 @@
         </mc:AlternateContent>
       </w:r>
       <w:r>
+        <w:rPr>
+          <w:noProof/>
+        </w:rPr>
         <w:drawing>
           <wp:inline distT="0" distB="0" distL="0" distR="0" wp14:anchorId="222E4A29" wp14:editId="07C2C0FA">
             <wp:extent cx="5943600" cy="2980690"/>
@@ -8317,6 +8368,7 @@
       <w:r>
         <w:rPr>
           <w:rFonts w:eastAsia="Times New Roman" w:cs="Helvetica"/>
+          <w:noProof/>
           <w:sz w:val="18"/>
           <w:szCs w:val="18"/>
         </w:rPr>
@@ -8616,6 +8668,7 @@
       <w:r>
         <w:rPr>
           <w:rFonts w:eastAsia="Times New Roman" w:cs="Helvetica"/>
+          <w:noProof/>
           <w:sz w:val="18"/>
           <w:szCs w:val="18"/>
         </w:rPr>
@@ -8996,6 +9049,7 @@
           <w:rFonts w:cs="Helvetica"/>
           <w:b w:val="0"/>
           <w:bCs w:val="0"/>
+          <w:noProof/>
           <w:sz w:val="18"/>
           <w:szCs w:val="18"/>
         </w:rPr>
@@ -9687,7 +9741,7 @@
           </mc:Choice>
           <mc:Fallback>
             <w:pict>
-              <v:shape w14:anchorId="4921233E" id="Text Box 17" o:spid="_x0000_s1029" type="#_x0000_t202" style="position:absolute;margin-left:51.75pt;margin-top:100pt;width:92.65pt;height:28pt;z-index:251664896;visibility:visible;mso-wrap-style:square;mso-wrap-distance-left:9pt;mso-wrap-distance-top:0;mso-wrap-distance-right:9pt;mso-wrap-distance-bottom:0;mso-position-horizontal:absolute;mso-position-horizontal-relative:text;mso-position-vertical:absolute;mso-position-vertical-relative:text;v-text-anchor:top" o:gfxdata="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" fillcolor="window" strokeweight=".5pt">
+              <v:shape w14:anchorId="4921233E" id="Text Box 17" o:spid="_x0000_s1029" type="#_x0000_t202" style="position:absolute;margin-left:51.75pt;margin-top:100pt;width:92.65pt;height:28pt;z-index:251664896;visibility:visible;mso-wrap-style:square;mso-wrap-distance-left:9pt;mso-wrap-distance-top:0;mso-wrap-distance-right:9pt;mso-wrap-distance-bottom:0;mso-position-horizontal:absolute;mso-position-horizontal-relative:text;mso-position-vertical:absolute;mso-position-vertical-relative:text;v-text-anchor:top" o:gfxdata="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" fillcolor="window" strokeweight=".5pt">
                 <v:textbox>
                   <w:txbxContent>
                     <w:p>
@@ -9986,6 +10040,7 @@
       <w:r>
         <w:rPr>
           <w:rFonts w:asciiTheme="minorHAnsi" w:hAnsiTheme="minorHAnsi" w:cs="Helvetica"/>
+          <w:noProof/>
           <w:sz w:val="20"/>
           <w:szCs w:val="20"/>
         </w:rPr>
@@ -10121,7 +10176,7 @@
           </mc:Choice>
           <mc:Fallback>
             <w:pict>
-              <v:shape w14:anchorId="4C8766E2" id="_x0000_s1030" type="#_x0000_t202" style="position:absolute;margin-left:416.45pt;margin-top:23.2pt;width:92.65pt;height:28pt;z-index:251683840;visibility:visible;mso-wrap-style:square;mso-wrap-distance-left:9pt;mso-wrap-distance-top:0;mso-wrap-distance-right:9pt;mso-wrap-distance-bottom:0;mso-position-horizontal:absolute;mso-position-horizontal-relative:text;mso-position-vertical:absolute;mso-position-vertical-relative:text;v-text-anchor:top" o:gfxdata="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" fillcolor="white [3201]" strokeweight=".5pt">
+              <v:shape w14:anchorId="4C8766E2" id="_x0000_s1030" type="#_x0000_t202" style="position:absolute;margin-left:416.45pt;margin-top:23.2pt;width:92.65pt;height:28pt;z-index:251683840;visibility:visible;mso-wrap-style:square;mso-wrap-distance-left:9pt;mso-wrap-distance-top:0;mso-wrap-distance-right:9pt;mso-wrap-distance-bottom:0;mso-position-horizontal:absolute;mso-position-horizontal-relative:text;mso-position-vertical:absolute;mso-position-vertical-relative:text;v-text-anchor:top" o:gfxdata="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" fillcolor="white [3201]" strokeweight=".5pt">
                 <v:textbox>
                   <w:txbxContent>
                     <w:p>
@@ -10840,7 +10895,7 @@
           <w14:ligatures w14:val="none"/>
         </w:rPr>
         <w:pict w14:anchorId="2B05BB45">
-          <v:rect id="_x0000_i1032" style="width:468pt;height:.85pt" o:hralign="center" o:hrstd="t" o:hr="t" fillcolor="#a0a0a0" stroked="f"/>
+          <v:rect id="_x0000_i1027" style="width:468pt;height:.85pt" o:hralign="center" o:hrstd="t" o:hr="t" fillcolor="#a0a0a0" stroked="f"/>
         </w:pict>
       </w:r>
     </w:p>
@@ -12521,7 +12576,7 @@
           <w14:ligatures w14:val="none"/>
         </w:rPr>
         <w:pict w14:anchorId="158DC2E0">
-          <v:rect id="_x0000_i1033" style="width:468pt;height:.85pt" o:hralign="center" o:hrstd="t" o:hr="t" fillcolor="#a0a0a0" stroked="f"/>
+          <v:rect id="_x0000_i1028" style="width:468pt;height:.85pt" o:hralign="center" o:hrstd="t" o:hr="t" fillcolor="#a0a0a0" stroked="f"/>
         </w:pict>
       </w:r>
     </w:p>
@@ -14402,7 +14457,7 @@
           <w14:ligatures w14:val="none"/>
         </w:rPr>
         <w:pict w14:anchorId="2D33B081">
-          <v:rect id="_x0000_i1034" style="width:468pt;height:.85pt" o:hralign="center" o:hrstd="t" o:hr="t" fillcolor="#a0a0a0" stroked="f"/>
+          <v:rect id="_x0000_i1029" style="width:468pt;height:.85pt" o:hralign="center" o:hrstd="t" o:hr="t" fillcolor="#a0a0a0" stroked="f"/>
         </w:pict>
       </w:r>
     </w:p>
@@ -15105,7 +15160,7 @@
           <w14:ligatures w14:val="none"/>
         </w:rPr>
         <w:pict w14:anchorId="021FB54A">
-          <v:rect id="_x0000_i1035" style="width:468pt;height:.85pt" o:hralign="center" o:hrstd="t" o:hr="t" fillcolor="#a0a0a0" stroked="f"/>
+          <v:rect id="_x0000_i1030" style="width:468pt;height:.85pt" o:hralign="center" o:hrstd="t" o:hr="t" fillcolor="#a0a0a0" stroked="f"/>
         </w:pict>
       </w:r>
     </w:p>
@@ -15424,7 +15479,7 @@
           <w14:ligatures w14:val="none"/>
         </w:rPr>
         <w:pict w14:anchorId="157A8032">
-          <v:rect id="_x0000_i1036" style="width:468pt;height:.85pt" o:hralign="center" o:hrstd="t" o:hr="t" fillcolor="#a0a0a0" stroked="f"/>
+          <v:rect id="_x0000_i1031" style="width:468pt;height:.85pt" o:hralign="center" o:hrstd="t" o:hr="t" fillcolor="#a0a0a0" stroked="f"/>
         </w:pict>
       </w:r>
     </w:p>
@@ -16102,7 +16157,7 @@
           <w14:ligatures w14:val="none"/>
         </w:rPr>
         <w:pict w14:anchorId="0FFF621C">
-          <v:rect id="_x0000_i1037" style="width:6in;height:.85pt" o:hralign="center" o:hrstd="t" o:hr="t" fillcolor="#a0a0a0" stroked="f"/>
+          <v:rect id="_x0000_i1032" style="width:6in;height:.85pt" o:hralign="center" o:hrstd="t" o:hr="t" fillcolor="#a0a0a0" stroked="f"/>
         </w:pict>
       </w:r>
     </w:p>
@@ -16315,7 +16370,7 @@
           <w14:ligatures w14:val="none"/>
         </w:rPr>
         <w:pict w14:anchorId="53639347">
-          <v:rect id="_x0000_i1038" style="width:468pt;height:.85pt" o:hralign="center" o:hrstd="t" o:hr="t" fillcolor="#a0a0a0" stroked="f"/>
+          <v:rect id="_x0000_i1033" style="width:468pt;height:.85pt" o:hralign="center" o:hrstd="t" o:hr="t" fillcolor="#a0a0a0" stroked="f"/>
         </w:pict>
       </w:r>
     </w:p>
@@ -16634,7 +16689,7 @@
           <w14:ligatures w14:val="none"/>
         </w:rPr>
         <w:pict w14:anchorId="2E15F318">
-          <v:rect id="_x0000_i1039" style="width:468pt;height:.85pt" o:hralign="center" o:hrstd="t" o:hr="t" fillcolor="#a0a0a0" stroked="f"/>
+          <v:rect id="_x0000_i1034" style="width:468pt;height:.85pt" o:hralign="center" o:hrstd="t" o:hr="t" fillcolor="#a0a0a0" stroked="f"/>
         </w:pict>
       </w:r>
     </w:p>
@@ -17003,7 +17058,7 @@
           <w14:ligatures w14:val="none"/>
         </w:rPr>
         <w:pict w14:anchorId="1B1BB391">
-          <v:rect id="_x0000_i1040" style="width:396pt;height:.85pt" o:hralign="center" o:hrstd="t" o:hr="t" fillcolor="#a0a0a0" stroked="f"/>
+          <v:rect id="_x0000_i1035" style="width:396pt;height:.85pt" o:hralign="center" o:hrstd="t" o:hr="t" fillcolor="#a0a0a0" stroked="f"/>
         </w:pict>
       </w:r>
     </w:p>
@@ -17358,7 +17413,7 @@
           <w14:ligatures w14:val="none"/>
         </w:rPr>
         <w:pict w14:anchorId="10C47EF8">
-          <v:rect id="_x0000_i1041" style="width:396pt;height:.85pt" o:hralign="center" o:hrstd="t" o:hr="t" fillcolor="#a0a0a0" stroked="f"/>
+          <v:rect id="_x0000_i1036" style="width:396pt;height:.85pt" o:hralign="center" o:hrstd="t" o:hr="t" fillcolor="#a0a0a0" stroked="f"/>
         </w:pict>
       </w:r>
     </w:p>
@@ -17762,7 +17817,7 @@
           <w14:ligatures w14:val="none"/>
         </w:rPr>
         <w:pict w14:anchorId="5D47B9E6">
-          <v:rect id="_x0000_i1042" style="width:468pt;height:.85pt" o:hralign="center" o:hrstd="t" o:hr="t" fillcolor="#a0a0a0" stroked="f"/>
+          <v:rect id="_x0000_i1037" style="width:468pt;height:.85pt" o:hralign="center" o:hrstd="t" o:hr="t" fillcolor="#a0a0a0" stroked="f"/>
         </w:pict>
       </w:r>
     </w:p>
@@ -18637,7 +18692,7 @@
           <w14:ligatures w14:val="none"/>
         </w:rPr>
         <w:pict w14:anchorId="6256F67D">
-          <v:rect id="_x0000_i1043" style="width:396pt;height:.85pt" o:hralign="center" o:hrstd="t" o:hr="t" fillcolor="#a0a0a0" stroked="f"/>
+          <v:rect id="_x0000_i1038" style="width:396pt;height:.85pt" o:hralign="center" o:hrstd="t" o:hr="t" fillcolor="#a0a0a0" stroked="f"/>
         </w:pict>
       </w:r>
     </w:p>
@@ -18739,7 +18794,7 @@
           <w14:ligatures w14:val="none"/>
         </w:rPr>
         <w:pict w14:anchorId="3D3B0DED">
-          <v:rect id="_x0000_i1044" style="width:468pt;height:.85pt" o:hralign="center" o:hrstd="t" o:hr="t" fillcolor="#a0a0a0" stroked="f"/>
+          <v:rect id="_x0000_i1039" style="width:468pt;height:.85pt" o:hralign="center" o:hrstd="t" o:hr="t" fillcolor="#a0a0a0" stroked="f"/>
         </w:pict>
       </w:r>
     </w:p>
@@ -19315,7 +19370,7 @@
           <w14:ligatures w14:val="none"/>
         </w:rPr>
         <w:pict w14:anchorId="1D9201E2">
-          <v:rect id="_x0000_i1045" style="width:468pt;height:.85pt" o:hralign="center" o:hrstd="t" o:hr="t" fillcolor="#a0a0a0" stroked="f"/>
+          <v:rect id="_x0000_i1040" style="width:468pt;height:.85pt" o:hralign="center" o:hrstd="t" o:hr="t" fillcolor="#a0a0a0" stroked="f"/>
         </w:pict>
       </w:r>
     </w:p>
@@ -19800,7 +19855,7 @@
           <w14:ligatures w14:val="none"/>
         </w:rPr>
         <w:pict w14:anchorId="2A3D8409">
-          <v:rect id="_x0000_i1046" style="width:468pt;height:.85pt" o:hralign="center" o:hrstd="t" o:hr="t" fillcolor="#a0a0a0" stroked="f"/>
+          <v:rect id="_x0000_i1041" style="width:468pt;height:.85pt" o:hralign="center" o:hrstd="t" o:hr="t" fillcolor="#a0a0a0" stroked="f"/>
         </w:pict>
       </w:r>
     </w:p>
@@ -20240,7 +20295,7 @@
           <w:szCs w:val="27"/>
         </w:rPr>
         <w:pict w14:anchorId="07215306">
-          <v:rect id="_x0000_i1047" style="width:468pt;height:.85pt" o:hralign="center" o:hrstd="t" o:hr="t" fillcolor="#a0a0a0" stroked="f"/>
+          <v:rect id="_x0000_i1042" style="width:468pt;height:.85pt" o:hralign="center" o:hrstd="t" o:hr="t" fillcolor="#a0a0a0" stroked="f"/>
         </w:pict>
       </w:r>
     </w:p>
@@ -20455,7 +20510,7 @@
         </w:rPr>
         <w:lastRenderedPageBreak/>
         <w:pict w14:anchorId="247AB591">
-          <v:rect id="_x0000_i1048" style="width:6in;height:.85pt" o:hralign="center" o:hrstd="t" o:hr="t" fillcolor="#a0a0a0" stroked="f"/>
+          <v:rect id="_x0000_i1043" style="width:6in;height:.85pt" o:hralign="center" o:hrstd="t" o:hr="t" fillcolor="#a0a0a0" stroked="f"/>
         </w:pict>
       </w:r>
     </w:p>
@@ -20606,7 +20661,7 @@
           <w:szCs w:val="27"/>
         </w:rPr>
         <w:pict w14:anchorId="129451D9">
-          <v:rect id="_x0000_i1049" style="width:6in;height:.85pt" o:hralign="center" o:hrstd="t" o:hr="t" fillcolor="#a0a0a0" stroked="f"/>
+          <v:rect id="_x0000_i1044" style="width:6in;height:.85pt" o:hralign="center" o:hrstd="t" o:hr="t" fillcolor="#a0a0a0" stroked="f"/>
         </w:pict>
       </w:r>
     </w:p>
@@ -20819,7 +20874,7 @@
           <w:szCs w:val="27"/>
         </w:rPr>
         <w:pict w14:anchorId="5F14A0F6">
-          <v:rect id="_x0000_i1050" style="width:6in;height:.85pt" o:hralign="center" o:hrstd="t" o:hr="t" fillcolor="#a0a0a0" stroked="f"/>
+          <v:rect id="_x0000_i1045" style="width:6in;height:.85pt" o:hralign="center" o:hrstd="t" o:hr="t" fillcolor="#a0a0a0" stroked="f"/>
         </w:pict>
       </w:r>
     </w:p>
@@ -21222,7 +21277,7 @@
           <w:szCs w:val="27"/>
         </w:rPr>
         <w:pict w14:anchorId="356FE0DF">
-          <v:rect id="_x0000_i1051" style="width:468pt;height:.85pt" o:hralign="center" o:hrstd="t" o:hr="t" fillcolor="#a0a0a0" stroked="f"/>
+          <v:rect id="_x0000_i1046" style="width:468pt;height:.85pt" o:hralign="center" o:hrstd="t" o:hr="t" fillcolor="#a0a0a0" stroked="f"/>
         </w:pict>
       </w:r>
     </w:p>
@@ -21460,7 +21515,7 @@
           <w:szCs w:val="27"/>
         </w:rPr>
         <w:pict w14:anchorId="2012AD3F">
-          <v:rect id="_x0000_i1052" style="width:468pt;height:.85pt" o:hralign="center" o:hrstd="t" o:hr="t" fillcolor="#a0a0a0" stroked="f"/>
+          <v:rect id="_x0000_i1047" style="width:468pt;height:.85pt" o:hralign="center" o:hrstd="t" o:hr="t" fillcolor="#a0a0a0" stroked="f"/>
         </w:pict>
       </w:r>
     </w:p>
@@ -21678,7 +21733,7 @@
           <w:szCs w:val="27"/>
         </w:rPr>
         <w:pict w14:anchorId="078D0263">
-          <v:rect id="_x0000_i1053" style="width:468pt;height:.85pt" o:hralign="center" o:hrstd="t" o:hr="t" fillcolor="#a0a0a0" stroked="f"/>
+          <v:rect id="_x0000_i1048" style="width:468pt;height:.85pt" o:hralign="center" o:hrstd="t" o:hr="t" fillcolor="#a0a0a0" stroked="f"/>
         </w:pict>
       </w:r>
     </w:p>
@@ -21961,7 +22016,7 @@
           <w:szCs w:val="27"/>
         </w:rPr>
         <w:pict w14:anchorId="47A141CB">
-          <v:rect id="_x0000_i1054" style="width:468pt;height:.85pt" o:hralign="center" o:hrstd="t" o:hr="t" fillcolor="#a0a0a0" stroked="f"/>
+          <v:rect id="_x0000_i1049" style="width:468pt;height:.85pt" o:hralign="center" o:hrstd="t" o:hr="t" fillcolor="#a0a0a0" stroked="f"/>
         </w:pict>
       </w:r>
     </w:p>
@@ -22083,7 +22138,7 @@
           <w:szCs w:val="27"/>
         </w:rPr>
         <w:pict w14:anchorId="1065DA92">
-          <v:rect id="_x0000_i1055" style="width:468pt;height:.85pt" o:hralign="center" o:hrstd="t" o:hr="t" fillcolor="#a0a0a0" stroked="f"/>
+          <v:rect id="_x0000_i1050" style="width:468pt;height:.85pt" o:hralign="center" o:hrstd="t" o:hr="t" fillcolor="#a0a0a0" stroked="f"/>
         </w:pict>
       </w:r>
     </w:p>
@@ -22344,7 +22399,7 @@
           <w:szCs w:val="27"/>
         </w:rPr>
         <w:pict w14:anchorId="2E7ED401">
-          <v:rect id="_x0000_i1056" style="width:396pt;height:.85pt" o:hralign="center" o:hrstd="t" o:hr="t" fillcolor="#a0a0a0" stroked="f"/>
+          <v:rect id="_x0000_i1051" style="width:396pt;height:.85pt" o:hralign="center" o:hrstd="t" o:hr="t" fillcolor="#a0a0a0" stroked="f"/>
         </w:pict>
       </w:r>
     </w:p>
@@ -22394,6 +22449,1437 @@
     <w:p>
       <w:r>
         <w:pict w14:anchorId="31AEB5C6">
+          <v:rect id="_x0000_i1052" style="width:468pt;height:.85pt" o:hralign="center" o:hrstd="t" o:hr="t" fillcolor="#a0a0a0" stroked="f"/>
+        </w:pict>
+      </w:r>
+    </w:p>
+    <w:p>
+      <w:pPr>
+        <w:rPr>
+          <w:b/>
+          <w:bCs/>
+        </w:rPr>
+      </w:pPr>
+      <w:r>
+        <w:rPr>
+          <w:rFonts w:ascii="Segoe UI Emoji" w:hAnsi="Segoe UI Emoji" w:cs="Segoe UI Emoji"/>
+          <w:b/>
+          <w:bCs/>
+        </w:rPr>
+        <w:t>🔧</w:t>
+      </w:r>
+      <w:r>
+        <w:rPr>
+          <w:b/>
+          <w:bCs/>
+        </w:rPr>
+        <w:t xml:space="preserve"> Step 1: Install and Enable UFW (Firewall)</w:t>
+      </w:r>
+    </w:p>
+    <w:p>
+      <w:proofErr w:type="spellStart"/>
+      <w:r>
+        <w:t>sudo</w:t>
+      </w:r>
+      <w:proofErr w:type="spellEnd"/>
+      <w:r>
+        <w:t xml:space="preserve"> apt update</w:t>
+      </w:r>
+    </w:p>
+    <w:p>
+      <w:proofErr w:type="spellStart"/>
+      <w:r>
+        <w:t>sudo</w:t>
+      </w:r>
+      <w:proofErr w:type="spellEnd"/>
+      <w:r>
+        <w:t xml:space="preserve"> apt install </w:t>
+      </w:r>
+      <w:proofErr w:type="spellStart"/>
+      <w:r>
+        <w:t>ufw</w:t>
+      </w:r>
+      <w:proofErr w:type="spellEnd"/>
+      <w:r>
+        <w:t xml:space="preserve"> -y</w:t>
+      </w:r>
+    </w:p>
+    <w:p/>
+    <w:p>
+      <w:r>
+        <w:t># Allow essential traffic</w:t>
+      </w:r>
+    </w:p>
+    <w:p>
+      <w:pPr>
+        <w:rPr>
+          <w:color w:val="BF4E14" w:themeColor="accent2" w:themeShade="BF"/>
+        </w:rPr>
+      </w:pPr>
+      <w:proofErr w:type="spellStart"/>
+      <w:r>
+        <w:rPr>
+          <w:color w:val="BF4E14" w:themeColor="accent2" w:themeShade="BF"/>
+        </w:rPr>
+        <w:t>sudo</w:t>
+      </w:r>
+      <w:proofErr w:type="spellEnd"/>
+      <w:r>
+        <w:rPr>
+          <w:color w:val="BF4E14" w:themeColor="accent2" w:themeShade="BF"/>
+        </w:rPr>
+        <w:t xml:space="preserve"> </w:t>
+      </w:r>
+      <w:proofErr w:type="spellStart"/>
+      <w:r>
+        <w:rPr>
+          <w:color w:val="BF4E14" w:themeColor="accent2" w:themeShade="BF"/>
+        </w:rPr>
+        <w:t>ufw</w:t>
+      </w:r>
+      <w:proofErr w:type="spellEnd"/>
+      <w:r>
+        <w:rPr>
+          <w:color w:val="BF4E14" w:themeColor="accent2" w:themeShade="BF"/>
+        </w:rPr>
+        <w:t xml:space="preserve"> allow OpenSSH</w:t>
+      </w:r>
+    </w:p>
+    <w:p>
+      <w:pPr>
+        <w:rPr>
+          <w:color w:val="BF4E14" w:themeColor="accent2" w:themeShade="BF"/>
+        </w:rPr>
+      </w:pPr>
+      <w:proofErr w:type="spellStart"/>
+      <w:r>
+        <w:rPr>
+          <w:color w:val="BF4E14" w:themeColor="accent2" w:themeShade="BF"/>
+        </w:rPr>
+        <w:t>sudo</w:t>
+      </w:r>
+      <w:proofErr w:type="spellEnd"/>
+      <w:r>
+        <w:rPr>
+          <w:color w:val="BF4E14" w:themeColor="accent2" w:themeShade="BF"/>
+        </w:rPr>
+        <w:t xml:space="preserve"> </w:t>
+      </w:r>
+      <w:proofErr w:type="spellStart"/>
+      <w:r>
+        <w:rPr>
+          <w:color w:val="BF4E14" w:themeColor="accent2" w:themeShade="BF"/>
+        </w:rPr>
+        <w:t>ufw</w:t>
+      </w:r>
+      <w:proofErr w:type="spellEnd"/>
+      <w:r>
+        <w:rPr>
+          <w:color w:val="BF4E14" w:themeColor="accent2" w:themeShade="BF"/>
+        </w:rPr>
+        <w:t xml:space="preserve"> allow 'Nginx Full'</w:t>
+      </w:r>
+    </w:p>
+    <w:p/>
+    <w:p>
+      <w:r>
+        <w:t># Enable firewall</w:t>
+      </w:r>
+    </w:p>
+    <w:p>
+      <w:pPr>
+        <w:rPr>
+          <w:color w:val="BF4E14" w:themeColor="accent2" w:themeShade="BF"/>
+        </w:rPr>
+      </w:pPr>
+      <w:proofErr w:type="spellStart"/>
+      <w:r>
+        <w:rPr>
+          <w:color w:val="BF4E14" w:themeColor="accent2" w:themeShade="BF"/>
+        </w:rPr>
+        <w:t>sudo</w:t>
+      </w:r>
+      <w:proofErr w:type="spellEnd"/>
+      <w:r>
+        <w:rPr>
+          <w:color w:val="BF4E14" w:themeColor="accent2" w:themeShade="BF"/>
+        </w:rPr>
+        <w:t xml:space="preserve"> </w:t>
+      </w:r>
+      <w:proofErr w:type="spellStart"/>
+      <w:r>
+        <w:rPr>
+          <w:color w:val="BF4E14" w:themeColor="accent2" w:themeShade="BF"/>
+        </w:rPr>
+        <w:t>ufw</w:t>
+      </w:r>
+      <w:proofErr w:type="spellEnd"/>
+      <w:r>
+        <w:rPr>
+          <w:color w:val="BF4E14" w:themeColor="accent2" w:themeShade="BF"/>
+        </w:rPr>
+        <w:t xml:space="preserve"> enable</w:t>
+      </w:r>
+    </w:p>
+    <w:p>
+      <w:pPr>
+        <w:rPr>
+          <w:color w:val="BF4E14" w:themeColor="accent2" w:themeShade="BF"/>
+        </w:rPr>
+      </w:pPr>
+      <w:proofErr w:type="spellStart"/>
+      <w:r>
+        <w:rPr>
+          <w:color w:val="BF4E14" w:themeColor="accent2" w:themeShade="BF"/>
+        </w:rPr>
+        <w:t>sudo</w:t>
+      </w:r>
+      <w:proofErr w:type="spellEnd"/>
+      <w:r>
+        <w:rPr>
+          <w:color w:val="BF4E14" w:themeColor="accent2" w:themeShade="BF"/>
+        </w:rPr>
+        <w:t xml:space="preserve"> </w:t>
+      </w:r>
+      <w:proofErr w:type="spellStart"/>
+      <w:r>
+        <w:rPr>
+          <w:color w:val="BF4E14" w:themeColor="accent2" w:themeShade="BF"/>
+        </w:rPr>
+        <w:t>ufw</w:t>
+      </w:r>
+      <w:proofErr w:type="spellEnd"/>
+      <w:r>
+        <w:rPr>
+          <w:color w:val="BF4E14" w:themeColor="accent2" w:themeShade="BF"/>
+        </w:rPr>
+        <w:t xml:space="preserve"> status verbose</w:t>
+      </w:r>
+    </w:p>
+    <w:p>
+      <w:r>
+        <w:pict w14:anchorId="16803490">
+          <v:rect id="_x0000_i1053" style="width:468pt;height:.85pt" o:hralign="center" o:hrstd="t" o:hr="t" fillcolor="#a0a0a0" stroked="f"/>
+        </w:pict>
+      </w:r>
+    </w:p>
+    <w:p>
+      <w:pPr>
+        <w:rPr>
+          <w:b/>
+          <w:bCs/>
+        </w:rPr>
+      </w:pPr>
+      <w:r>
+        <w:rPr>
+          <w:rFonts w:ascii="Segoe UI Emoji" w:hAnsi="Segoe UI Emoji" w:cs="Segoe UI Emoji"/>
+          <w:b/>
+          <w:bCs/>
+        </w:rPr>
+        <w:t>🛡️</w:t>
+      </w:r>
+      <w:r>
+        <w:rPr>
+          <w:b/>
+          <w:bCs/>
+        </w:rPr>
+        <w:t xml:space="preserve"> Step 2: Install and Configure Fail2Ban</w:t>
+      </w:r>
+    </w:p>
+    <w:p>
+      <w:pPr>
+        <w:rPr>
+          <w:color w:val="BF4E14" w:themeColor="accent2" w:themeShade="BF"/>
+        </w:rPr>
+      </w:pPr>
+      <w:proofErr w:type="spellStart"/>
+      <w:r>
+        <w:rPr>
+          <w:color w:val="BF4E14" w:themeColor="accent2" w:themeShade="BF"/>
+        </w:rPr>
+        <w:t>sudo</w:t>
+      </w:r>
+      <w:proofErr w:type="spellEnd"/>
+      <w:r>
+        <w:rPr>
+          <w:color w:val="BF4E14" w:themeColor="accent2" w:themeShade="BF"/>
+        </w:rPr>
+        <w:t xml:space="preserve"> apt install fail2ban -y</w:t>
+      </w:r>
+    </w:p>
+    <w:p>
+      <w:r>
+        <w:t>Then create a custom jail for Nginx:</w:t>
+      </w:r>
+    </w:p>
+    <w:p>
+      <w:pPr>
+        <w:rPr>
+          <w:color w:val="BF4E14" w:themeColor="accent2" w:themeShade="BF"/>
+        </w:rPr>
+      </w:pPr>
+      <w:proofErr w:type="spellStart"/>
+      <w:r>
+        <w:rPr>
+          <w:color w:val="BF4E14" w:themeColor="accent2" w:themeShade="BF"/>
+        </w:rPr>
+        <w:t>sudo</w:t>
+      </w:r>
+      <w:proofErr w:type="spellEnd"/>
+      <w:r>
+        <w:rPr>
+          <w:color w:val="BF4E14" w:themeColor="accent2" w:themeShade="BF"/>
+        </w:rPr>
+        <w:t xml:space="preserve"> nano /</w:t>
+      </w:r>
+      <w:proofErr w:type="spellStart"/>
+      <w:r>
+        <w:rPr>
+          <w:color w:val="BF4E14" w:themeColor="accent2" w:themeShade="BF"/>
+        </w:rPr>
+        <w:t>etc</w:t>
+      </w:r>
+      <w:proofErr w:type="spellEnd"/>
+      <w:r>
+        <w:rPr>
+          <w:color w:val="BF4E14" w:themeColor="accent2" w:themeShade="BF"/>
+        </w:rPr>
+        <w:t>/fail2ban/</w:t>
+      </w:r>
+      <w:proofErr w:type="spellStart"/>
+      <w:r>
+        <w:rPr>
+          <w:color w:val="BF4E14" w:themeColor="accent2" w:themeShade="BF"/>
+        </w:rPr>
+        <w:t>jail.d</w:t>
+      </w:r>
+      <w:proofErr w:type="spellEnd"/>
+      <w:r>
+        <w:rPr>
+          <w:color w:val="BF4E14" w:themeColor="accent2" w:themeShade="BF"/>
+        </w:rPr>
+        <w:t>/nginx-404.conf</w:t>
+      </w:r>
+    </w:p>
+    <w:p>
+      <w:r>
+        <w:t>Paste the following:</w:t>
+      </w:r>
+    </w:p>
+    <w:p>
+      <w:pPr>
+        <w:rPr>
+          <w:color w:val="BF4E14" w:themeColor="accent2" w:themeShade="BF"/>
+        </w:rPr>
+      </w:pPr>
+      <w:r>
+        <w:rPr>
+          <w:color w:val="BF4E14" w:themeColor="accent2" w:themeShade="BF"/>
+        </w:rPr>
+        <w:t>[nginx-404]</w:t>
+      </w:r>
+    </w:p>
+    <w:p>
+      <w:pPr>
+        <w:rPr>
+          <w:color w:val="BF4E14" w:themeColor="accent2" w:themeShade="BF"/>
+        </w:rPr>
+      </w:pPr>
+      <w:r>
+        <w:rPr>
+          <w:color w:val="BF4E14" w:themeColor="accent2" w:themeShade="BF"/>
+        </w:rPr>
+        <w:t>enabled = true</w:t>
+      </w:r>
+    </w:p>
+    <w:p>
+      <w:pPr>
+        <w:rPr>
+          <w:color w:val="BF4E14" w:themeColor="accent2" w:themeShade="BF"/>
+        </w:rPr>
+      </w:pPr>
+      <w:r>
+        <w:rPr>
+          <w:color w:val="BF4E14" w:themeColor="accent2" w:themeShade="BF"/>
+        </w:rPr>
+        <w:t xml:space="preserve">port = </w:t>
+      </w:r>
+      <w:proofErr w:type="spellStart"/>
+      <w:proofErr w:type="gramStart"/>
+      <w:r>
+        <w:rPr>
+          <w:color w:val="BF4E14" w:themeColor="accent2" w:themeShade="BF"/>
+        </w:rPr>
+        <w:t>http,https</w:t>
+      </w:r>
+      <w:proofErr w:type="spellEnd"/>
+      <w:proofErr w:type="gramEnd"/>
+    </w:p>
+    <w:p>
+      <w:pPr>
+        <w:rPr>
+          <w:color w:val="BF4E14" w:themeColor="accent2" w:themeShade="BF"/>
+        </w:rPr>
+      </w:pPr>
+      <w:r>
+        <w:rPr>
+          <w:color w:val="BF4E14" w:themeColor="accent2" w:themeShade="BF"/>
+        </w:rPr>
+        <w:t>filter = nginx-404</w:t>
+      </w:r>
+    </w:p>
+    <w:p>
+      <w:pPr>
+        <w:rPr>
+          <w:color w:val="BF4E14" w:themeColor="accent2" w:themeShade="BF"/>
+        </w:rPr>
+      </w:pPr>
+      <w:proofErr w:type="spellStart"/>
+      <w:r>
+        <w:rPr>
+          <w:color w:val="BF4E14" w:themeColor="accent2" w:themeShade="BF"/>
+        </w:rPr>
+        <w:t>logpath</w:t>
+      </w:r>
+      <w:proofErr w:type="spellEnd"/>
+      <w:r>
+        <w:rPr>
+          <w:color w:val="BF4E14" w:themeColor="accent2" w:themeShade="BF"/>
+        </w:rPr>
+        <w:t xml:space="preserve"> = /var/log/nginx/access.log</w:t>
+      </w:r>
+    </w:p>
+    <w:p>
+      <w:pPr>
+        <w:rPr>
+          <w:color w:val="BF4E14" w:themeColor="accent2" w:themeShade="BF"/>
+        </w:rPr>
+      </w:pPr>
+      <w:proofErr w:type="spellStart"/>
+      <w:r>
+        <w:rPr>
+          <w:color w:val="BF4E14" w:themeColor="accent2" w:themeShade="BF"/>
+        </w:rPr>
+        <w:t>maxretry</w:t>
+      </w:r>
+      <w:proofErr w:type="spellEnd"/>
+      <w:r>
+        <w:rPr>
+          <w:color w:val="BF4E14" w:themeColor="accent2" w:themeShade="BF"/>
+        </w:rPr>
+        <w:t xml:space="preserve"> = 5</w:t>
+      </w:r>
+    </w:p>
+    <w:p>
+      <w:pPr>
+        <w:rPr>
+          <w:color w:val="BF4E14" w:themeColor="accent2" w:themeShade="BF"/>
+        </w:rPr>
+      </w:pPr>
+      <w:proofErr w:type="spellStart"/>
+      <w:proofErr w:type="gramStart"/>
+      <w:r>
+        <w:rPr>
+          <w:color w:val="BF4E14" w:themeColor="accent2" w:themeShade="BF"/>
+        </w:rPr>
+        <w:lastRenderedPageBreak/>
+        <w:t>findtime</w:t>
+      </w:r>
+      <w:proofErr w:type="spellEnd"/>
+      <w:proofErr w:type="gramEnd"/>
+      <w:r>
+        <w:rPr>
+          <w:color w:val="BF4E14" w:themeColor="accent2" w:themeShade="BF"/>
+        </w:rPr>
+        <w:t xml:space="preserve"> = 600</w:t>
+      </w:r>
+    </w:p>
+    <w:p>
+      <w:pPr>
+        <w:rPr>
+          <w:color w:val="BF4E14" w:themeColor="accent2" w:themeShade="BF"/>
+        </w:rPr>
+      </w:pPr>
+      <w:proofErr w:type="spellStart"/>
+      <w:r>
+        <w:rPr>
+          <w:color w:val="BF4E14" w:themeColor="accent2" w:themeShade="BF"/>
+        </w:rPr>
+        <w:t>bantime</w:t>
+      </w:r>
+      <w:proofErr w:type="spellEnd"/>
+      <w:r>
+        <w:rPr>
+          <w:color w:val="BF4E14" w:themeColor="accent2" w:themeShade="BF"/>
+        </w:rPr>
+        <w:t xml:space="preserve"> = 86400</w:t>
+      </w:r>
+    </w:p>
+    <w:p>
+      <w:pPr>
+        <w:rPr>
+          <w:color w:val="BF4E14" w:themeColor="accent2" w:themeShade="BF"/>
+        </w:rPr>
+      </w:pPr>
+      <w:r>
+        <w:rPr>
+          <w:color w:val="BF4E14" w:themeColor="accent2" w:themeShade="BF"/>
+        </w:rPr>
+        <w:t>Now create the filter:</w:t>
+      </w:r>
+    </w:p>
+    <w:p>
+      <w:pPr>
+        <w:rPr>
+          <w:color w:val="BF4E14" w:themeColor="accent2" w:themeShade="BF"/>
+        </w:rPr>
+      </w:pPr>
+      <w:proofErr w:type="spellStart"/>
+      <w:r>
+        <w:rPr>
+          <w:color w:val="BF4E14" w:themeColor="accent2" w:themeShade="BF"/>
+        </w:rPr>
+        <w:t>sudo</w:t>
+      </w:r>
+      <w:proofErr w:type="spellEnd"/>
+      <w:r>
+        <w:rPr>
+          <w:color w:val="BF4E14" w:themeColor="accent2" w:themeShade="BF"/>
+        </w:rPr>
+        <w:t xml:space="preserve"> nano /</w:t>
+      </w:r>
+      <w:proofErr w:type="spellStart"/>
+      <w:r>
+        <w:rPr>
+          <w:color w:val="BF4E14" w:themeColor="accent2" w:themeShade="BF"/>
+        </w:rPr>
+        <w:t>etc</w:t>
+      </w:r>
+      <w:proofErr w:type="spellEnd"/>
+      <w:r>
+        <w:rPr>
+          <w:color w:val="BF4E14" w:themeColor="accent2" w:themeShade="BF"/>
+        </w:rPr>
+        <w:t>/fail2ban/</w:t>
+      </w:r>
+      <w:proofErr w:type="spellStart"/>
+      <w:r>
+        <w:rPr>
+          <w:color w:val="BF4E14" w:themeColor="accent2" w:themeShade="BF"/>
+        </w:rPr>
+        <w:t>filter.d</w:t>
+      </w:r>
+      <w:proofErr w:type="spellEnd"/>
+      <w:r>
+        <w:rPr>
+          <w:color w:val="BF4E14" w:themeColor="accent2" w:themeShade="BF"/>
+        </w:rPr>
+        <w:t>/nginx-404.conf</w:t>
+      </w:r>
+    </w:p>
+    <w:p>
+      <w:pPr>
+        <w:rPr>
+          <w:color w:val="BF4E14" w:themeColor="accent2" w:themeShade="BF"/>
+        </w:rPr>
+      </w:pPr>
+      <w:r>
+        <w:rPr>
+          <w:color w:val="BF4E14" w:themeColor="accent2" w:themeShade="BF"/>
+        </w:rPr>
+        <w:t>Add this pattern to detect repeated 404s and .</w:t>
+      </w:r>
+      <w:proofErr w:type="spellStart"/>
+      <w:r>
+        <w:rPr>
+          <w:color w:val="BF4E14" w:themeColor="accent2" w:themeShade="BF"/>
+        </w:rPr>
+        <w:t>php</w:t>
+      </w:r>
+      <w:proofErr w:type="spellEnd"/>
+      <w:r>
+        <w:rPr>
+          <w:color w:val="BF4E14" w:themeColor="accent2" w:themeShade="BF"/>
+        </w:rPr>
+        <w:t xml:space="preserve"> scans:</w:t>
+      </w:r>
+    </w:p>
+    <w:p>
+      <w:pPr>
+        <w:rPr>
+          <w:color w:val="BF4E14" w:themeColor="accent2" w:themeShade="BF"/>
+        </w:rPr>
+      </w:pPr>
+      <w:r>
+        <w:rPr>
+          <w:color w:val="BF4E14" w:themeColor="accent2" w:themeShade="BF"/>
+        </w:rPr>
+        <w:t>[Definition]</w:t>
+      </w:r>
+    </w:p>
+    <w:p>
+      <w:pPr>
+        <w:rPr>
+          <w:color w:val="BF4E14" w:themeColor="accent2" w:themeShade="BF"/>
+        </w:rPr>
+      </w:pPr>
+      <w:proofErr w:type="spellStart"/>
+      <w:r>
+        <w:rPr>
+          <w:color w:val="BF4E14" w:themeColor="accent2" w:themeShade="BF"/>
+        </w:rPr>
+        <w:t>failregex</w:t>
+      </w:r>
+      <w:proofErr w:type="spellEnd"/>
+      <w:r>
+        <w:rPr>
+          <w:color w:val="BF4E14" w:themeColor="accent2" w:themeShade="BF"/>
+        </w:rPr>
+        <w:t xml:space="preserve"> = &lt;HOST&gt; </w:t>
+      </w:r>
+      <w:proofErr w:type="gramStart"/>
+      <w:r>
+        <w:rPr>
+          <w:color w:val="BF4E14" w:themeColor="accent2" w:themeShade="BF"/>
+        </w:rPr>
+        <w:t>-.*</w:t>
+      </w:r>
+      <w:proofErr w:type="gramEnd"/>
+      <w:r>
+        <w:rPr>
+          <w:color w:val="BF4E14" w:themeColor="accent2" w:themeShade="BF"/>
+        </w:rPr>
+        <w:t>"(GET|POST</w:t>
+      </w:r>
+      <w:proofErr w:type="gramStart"/>
+      <w:r>
+        <w:rPr>
+          <w:color w:val="BF4E14" w:themeColor="accent2" w:themeShade="BF"/>
+        </w:rPr>
+        <w:t>) .</w:t>
+      </w:r>
+      <w:proofErr w:type="gramEnd"/>
+      <w:r>
+        <w:rPr>
+          <w:color w:val="BF4E14" w:themeColor="accent2" w:themeShade="BF"/>
+        </w:rPr>
+        <w:t>*\.</w:t>
+      </w:r>
+      <w:proofErr w:type="spellStart"/>
+      <w:r>
+        <w:rPr>
+          <w:color w:val="BF4E14" w:themeColor="accent2" w:themeShade="BF"/>
+        </w:rPr>
+        <w:t>php</w:t>
+      </w:r>
+      <w:proofErr w:type="spellEnd"/>
+      <w:r>
+        <w:rPr>
+          <w:color w:val="BF4E14" w:themeColor="accent2" w:themeShade="BF"/>
+        </w:rPr>
+        <w:t xml:space="preserve"> </w:t>
+      </w:r>
+      <w:proofErr w:type="gramStart"/>
+      <w:r>
+        <w:rPr>
+          <w:color w:val="BF4E14" w:themeColor="accent2" w:themeShade="BF"/>
+        </w:rPr>
+        <w:t>HTTP.*</w:t>
+      </w:r>
+      <w:proofErr w:type="gramEnd"/>
+      <w:r>
+        <w:rPr>
+          <w:color w:val="BF4E14" w:themeColor="accent2" w:themeShade="BF"/>
+        </w:rPr>
+        <w:t>" 404</w:t>
+      </w:r>
+    </w:p>
+    <w:p>
+      <w:pPr>
+        <w:rPr>
+          <w:color w:val="BF4E14" w:themeColor="accent2" w:themeShade="BF"/>
+        </w:rPr>
+      </w:pPr>
+      <w:r>
+        <w:rPr>
+          <w:color w:val="BF4E14" w:themeColor="accent2" w:themeShade="BF"/>
+        </w:rPr>
+        <w:t xml:space="preserve">         </w:t>
+      </w:r>
+      <w:r>
+        <w:rPr>
+          <w:color w:val="BF4E14" w:themeColor="accent2" w:themeShade="BF"/>
+        </w:rPr>
+        <w:t xml:space="preserve">           </w:t>
+      </w:r>
+      <w:r>
+        <w:rPr>
+          <w:color w:val="BF4E14" w:themeColor="accent2" w:themeShade="BF"/>
+        </w:rPr>
+        <w:t xml:space="preserve">   &lt;HOST&gt; </w:t>
+      </w:r>
+      <w:proofErr w:type="gramStart"/>
+      <w:r>
+        <w:rPr>
+          <w:color w:val="BF4E14" w:themeColor="accent2" w:themeShade="BF"/>
+        </w:rPr>
+        <w:t>-.*</w:t>
+      </w:r>
+      <w:proofErr w:type="gramEnd"/>
+      <w:r>
+        <w:rPr>
+          <w:color w:val="BF4E14" w:themeColor="accent2" w:themeShade="BF"/>
+        </w:rPr>
+        <w:t>"(GET|POST</w:t>
+      </w:r>
+      <w:proofErr w:type="gramStart"/>
+      <w:r>
+        <w:rPr>
+          <w:color w:val="BF4E14" w:themeColor="accent2" w:themeShade="BF"/>
+        </w:rPr>
+        <w:t>) .</w:t>
+      </w:r>
+      <w:proofErr w:type="gramEnd"/>
+      <w:r>
+        <w:rPr>
+          <w:color w:val="BF4E14" w:themeColor="accent2" w:themeShade="BF"/>
+        </w:rPr>
+        <w:t xml:space="preserve">* </w:t>
+      </w:r>
+      <w:proofErr w:type="gramStart"/>
+      <w:r>
+        <w:rPr>
+          <w:color w:val="BF4E14" w:themeColor="accent2" w:themeShade="BF"/>
+        </w:rPr>
+        <w:t>HTTP.*</w:t>
+      </w:r>
+      <w:proofErr w:type="gramEnd"/>
+      <w:r>
+        <w:rPr>
+          <w:color w:val="BF4E14" w:themeColor="accent2" w:themeShade="BF"/>
+        </w:rPr>
+        <w:t>" 404</w:t>
+      </w:r>
+    </w:p>
+    <w:p>
+      <w:pPr>
+        <w:rPr>
+          <w:color w:val="BF4E14" w:themeColor="accent2" w:themeShade="BF"/>
+        </w:rPr>
+      </w:pPr>
+      <w:proofErr w:type="spellStart"/>
+      <w:r>
+        <w:rPr>
+          <w:color w:val="BF4E14" w:themeColor="accent2" w:themeShade="BF"/>
+        </w:rPr>
+        <w:t>ignoreregex</w:t>
+      </w:r>
+      <w:proofErr w:type="spellEnd"/>
+      <w:r>
+        <w:rPr>
+          <w:color w:val="BF4E14" w:themeColor="accent2" w:themeShade="BF"/>
+        </w:rPr>
+        <w:t xml:space="preserve"> =</w:t>
+      </w:r>
+    </w:p>
+    <w:p>
+      <w:r>
+        <w:t>Then restart Fail2Ban:</w:t>
+      </w:r>
+    </w:p>
+    <w:p>
+      <w:pPr>
+        <w:rPr>
+          <w:color w:val="BF4E14" w:themeColor="accent2" w:themeShade="BF"/>
+        </w:rPr>
+      </w:pPr>
+      <w:proofErr w:type="spellStart"/>
+      <w:r>
+        <w:rPr>
+          <w:color w:val="BF4E14" w:themeColor="accent2" w:themeShade="BF"/>
+        </w:rPr>
+        <w:t>sudo</w:t>
+      </w:r>
+      <w:proofErr w:type="spellEnd"/>
+      <w:r>
+        <w:rPr>
+          <w:color w:val="BF4E14" w:themeColor="accent2" w:themeShade="BF"/>
+        </w:rPr>
+        <w:t xml:space="preserve"> </w:t>
+      </w:r>
+      <w:proofErr w:type="spellStart"/>
+      <w:r>
+        <w:rPr>
+          <w:color w:val="BF4E14" w:themeColor="accent2" w:themeShade="BF"/>
+        </w:rPr>
+        <w:t>systemctl</w:t>
+      </w:r>
+      <w:proofErr w:type="spellEnd"/>
+      <w:r>
+        <w:rPr>
+          <w:color w:val="BF4E14" w:themeColor="accent2" w:themeShade="BF"/>
+        </w:rPr>
+        <w:t xml:space="preserve"> restart fail2ban</w:t>
+      </w:r>
+    </w:p>
+    <w:p>
+      <w:pPr>
+        <w:rPr>
+          <w:color w:val="BF4E14" w:themeColor="accent2" w:themeShade="BF"/>
+        </w:rPr>
+      </w:pPr>
+      <w:proofErr w:type="spellStart"/>
+      <w:r>
+        <w:rPr>
+          <w:color w:val="BF4E14" w:themeColor="accent2" w:themeShade="BF"/>
+        </w:rPr>
+        <w:t>sudo</w:t>
+      </w:r>
+      <w:proofErr w:type="spellEnd"/>
+      <w:r>
+        <w:rPr>
+          <w:color w:val="BF4E14" w:themeColor="accent2" w:themeShade="BF"/>
+        </w:rPr>
+        <w:t xml:space="preserve"> </w:t>
+      </w:r>
+      <w:proofErr w:type="spellStart"/>
+      <w:r>
+        <w:rPr>
+          <w:color w:val="BF4E14" w:themeColor="accent2" w:themeShade="BF"/>
+        </w:rPr>
+        <w:t>systemctl</w:t>
+      </w:r>
+      <w:proofErr w:type="spellEnd"/>
+      <w:r>
+        <w:rPr>
+          <w:color w:val="BF4E14" w:themeColor="accent2" w:themeShade="BF"/>
+        </w:rPr>
+        <w:t xml:space="preserve"> enable fail2ban</w:t>
+      </w:r>
+    </w:p>
+    <w:p>
+      <w:r>
+        <w:rPr>
+          <w:rFonts w:ascii="Segoe UI Emoji" w:hAnsi="Segoe UI Emoji" w:cs="Segoe UI Emoji"/>
+        </w:rPr>
+        <w:t>✅</w:t>
+      </w:r>
+      <w:r>
+        <w:t xml:space="preserve"> Check status:</w:t>
+      </w:r>
+    </w:p>
+    <w:p>
+      <w:pPr>
+        <w:rPr>
+          <w:color w:val="BF4E14" w:themeColor="accent2" w:themeShade="BF"/>
+        </w:rPr>
+      </w:pPr>
+      <w:proofErr w:type="spellStart"/>
+      <w:r>
+        <w:rPr>
+          <w:color w:val="BF4E14" w:themeColor="accent2" w:themeShade="BF"/>
+        </w:rPr>
+        <w:t>sudo</w:t>
+      </w:r>
+      <w:proofErr w:type="spellEnd"/>
+      <w:r>
+        <w:rPr>
+          <w:color w:val="BF4E14" w:themeColor="accent2" w:themeShade="BF"/>
+        </w:rPr>
+        <w:t xml:space="preserve"> fail2ban-client status nginx-404</w:t>
+      </w:r>
+    </w:p>
+    <w:p>
+      <w:r>
+        <w:pict w14:anchorId="4F6D44AA">
+          <v:rect id="_x0000_i1054" style="width:468pt;height:.85pt" o:hralign="center" o:hrstd="t" o:hr="t" fillcolor="#a0a0a0" stroked="f"/>
+        </w:pict>
+      </w:r>
+    </w:p>
+    <w:p>
+      <w:pPr>
+        <w:rPr>
+          <w:b/>
+          <w:bCs/>
+        </w:rPr>
+      </w:pPr>
+      <w:r>
+        <w:rPr>
+          <w:rFonts w:ascii="Segoe UI Emoji" w:hAnsi="Segoe UI Emoji" w:cs="Segoe UI Emoji"/>
+          <w:b/>
+          <w:bCs/>
+        </w:rPr>
+        <w:t>🔍</w:t>
+      </w:r>
+      <w:r>
+        <w:rPr>
+          <w:b/>
+          <w:bCs/>
+        </w:rPr>
+        <w:t xml:space="preserve"> Step 3: Detect Suspicious IPs from Nginx Logs</w:t>
+      </w:r>
+    </w:p>
+    <w:p>
+      <w:r>
+        <w:t>To find top IPs scanning for .</w:t>
+      </w:r>
+      <w:proofErr w:type="spellStart"/>
+      <w:r>
+        <w:t>php</w:t>
+      </w:r>
+      <w:proofErr w:type="spellEnd"/>
+      <w:r>
+        <w:t xml:space="preserve"> files or triggering 404s:</w:t>
+      </w:r>
+    </w:p>
+    <w:p>
+      <w:pPr>
+        <w:rPr>
+          <w:color w:val="BF4E14" w:themeColor="accent2" w:themeShade="BF"/>
+        </w:rPr>
+      </w:pPr>
+      <w:proofErr w:type="spellStart"/>
+      <w:r>
+        <w:rPr>
+          <w:color w:val="BF4E14" w:themeColor="accent2" w:themeShade="BF"/>
+        </w:rPr>
+        <w:t>sudo</w:t>
+      </w:r>
+      <w:proofErr w:type="spellEnd"/>
+      <w:r>
+        <w:rPr>
+          <w:color w:val="BF4E14" w:themeColor="accent2" w:themeShade="BF"/>
+        </w:rPr>
+        <w:t xml:space="preserve"> grep -E "</w:t>
+      </w:r>
+      <w:proofErr w:type="gramStart"/>
+      <w:r>
+        <w:rPr>
+          <w:color w:val="BF4E14" w:themeColor="accent2" w:themeShade="BF"/>
+        </w:rPr>
+        <w:t>GET .</w:t>
+      </w:r>
+      <w:proofErr w:type="gramEnd"/>
+      <w:r>
+        <w:rPr>
+          <w:color w:val="BF4E14" w:themeColor="accent2" w:themeShade="BF"/>
+        </w:rPr>
+        <w:t>*\.</w:t>
+      </w:r>
+      <w:proofErr w:type="spellStart"/>
+      <w:r>
+        <w:rPr>
+          <w:color w:val="BF4E14" w:themeColor="accent2" w:themeShade="BF"/>
+        </w:rPr>
+        <w:t>php|</w:t>
+      </w:r>
+      <w:proofErr w:type="gramStart"/>
+      <w:r>
+        <w:rPr>
+          <w:color w:val="BF4E14" w:themeColor="accent2" w:themeShade="BF"/>
+        </w:rPr>
+        <w:t>POST</w:t>
+      </w:r>
+      <w:proofErr w:type="spellEnd"/>
+      <w:r>
+        <w:rPr>
+          <w:color w:val="BF4E14" w:themeColor="accent2" w:themeShade="BF"/>
+        </w:rPr>
+        <w:t xml:space="preserve"> .</w:t>
+      </w:r>
+      <w:proofErr w:type="gramEnd"/>
+      <w:r>
+        <w:rPr>
+          <w:color w:val="BF4E14" w:themeColor="accent2" w:themeShade="BF"/>
+        </w:rPr>
+        <w:t>*\.</w:t>
+      </w:r>
+      <w:proofErr w:type="spellStart"/>
+      <w:r>
+        <w:rPr>
+          <w:color w:val="BF4E14" w:themeColor="accent2" w:themeShade="BF"/>
+        </w:rPr>
+        <w:t>php</w:t>
+      </w:r>
+      <w:proofErr w:type="spellEnd"/>
+      <w:r>
+        <w:rPr>
+          <w:color w:val="BF4E14" w:themeColor="accent2" w:themeShade="BF"/>
+        </w:rPr>
+        <w:t>" /var/log/nginx/access.log \</w:t>
+      </w:r>
+    </w:p>
+    <w:p>
+      <w:pPr>
+        <w:rPr>
+          <w:color w:val="BF4E14" w:themeColor="accent2" w:themeShade="BF"/>
+        </w:rPr>
+      </w:pPr>
+      <w:proofErr w:type="gramStart"/>
+      <w:r>
+        <w:rPr>
+          <w:color w:val="BF4E14" w:themeColor="accent2" w:themeShade="BF"/>
+        </w:rPr>
+        <w:t>| awk '{</w:t>
+      </w:r>
+      <w:proofErr w:type="gramEnd"/>
+      <w:r>
+        <w:rPr>
+          <w:color w:val="BF4E14" w:themeColor="accent2" w:themeShade="BF"/>
+        </w:rPr>
+        <w:t>print $</w:t>
+      </w:r>
+      <w:proofErr w:type="gramStart"/>
+      <w:r>
+        <w:rPr>
+          <w:color w:val="BF4E14" w:themeColor="accent2" w:themeShade="BF"/>
+        </w:rPr>
+        <w:t>1}' |</w:t>
+      </w:r>
+      <w:proofErr w:type="gramEnd"/>
+      <w:r>
+        <w:rPr>
+          <w:color w:val="BF4E14" w:themeColor="accent2" w:themeShade="BF"/>
+        </w:rPr>
+        <w:t xml:space="preserve"> sort | </w:t>
+      </w:r>
+      <w:proofErr w:type="spellStart"/>
+      <w:r>
+        <w:rPr>
+          <w:color w:val="BF4E14" w:themeColor="accent2" w:themeShade="BF"/>
+        </w:rPr>
+        <w:t>uniq</w:t>
+      </w:r>
+      <w:proofErr w:type="spellEnd"/>
+      <w:r>
+        <w:rPr>
+          <w:color w:val="BF4E14" w:themeColor="accent2" w:themeShade="BF"/>
+        </w:rPr>
+        <w:t xml:space="preserve"> -c | sort -nr | head -20</w:t>
+      </w:r>
+    </w:p>
+    <w:p>
+      <w:r>
+        <w:rPr>
+          <w:rFonts w:ascii="Segoe UI Emoji" w:hAnsi="Segoe UI Emoji" w:cs="Segoe UI Emoji"/>
+        </w:rPr>
+        <w:t>✅</w:t>
+      </w:r>
+      <w:r>
+        <w:t xml:space="preserve"> Optional: Check for all 404s:</w:t>
+      </w:r>
+    </w:p>
+    <w:p>
+      <w:pPr>
+        <w:rPr>
+          <w:color w:val="BF4E14" w:themeColor="accent2" w:themeShade="BF"/>
+        </w:rPr>
+      </w:pPr>
+      <w:proofErr w:type="spellStart"/>
+      <w:r>
+        <w:rPr>
+          <w:color w:val="BF4E14" w:themeColor="accent2" w:themeShade="BF"/>
+        </w:rPr>
+        <w:t>sudo</w:t>
+      </w:r>
+      <w:proofErr w:type="spellEnd"/>
+      <w:r>
+        <w:rPr>
+          <w:color w:val="BF4E14" w:themeColor="accent2" w:themeShade="BF"/>
+        </w:rPr>
+        <w:t xml:space="preserve"> grep ' 404 ' /var/log/nginx/access.log | awk '{print $</w:t>
+      </w:r>
+      <w:proofErr w:type="gramStart"/>
+      <w:r>
+        <w:rPr>
+          <w:color w:val="BF4E14" w:themeColor="accent2" w:themeShade="BF"/>
+        </w:rPr>
+        <w:t>1}' |</w:t>
+      </w:r>
+      <w:proofErr w:type="gramEnd"/>
+      <w:r>
+        <w:rPr>
+          <w:color w:val="BF4E14" w:themeColor="accent2" w:themeShade="BF"/>
+        </w:rPr>
+        <w:t xml:space="preserve"> sort | </w:t>
+      </w:r>
+      <w:proofErr w:type="spellStart"/>
+      <w:r>
+        <w:rPr>
+          <w:color w:val="BF4E14" w:themeColor="accent2" w:themeShade="BF"/>
+        </w:rPr>
+        <w:t>uniq</w:t>
+      </w:r>
+      <w:proofErr w:type="spellEnd"/>
+      <w:r>
+        <w:rPr>
+          <w:color w:val="BF4E14" w:themeColor="accent2" w:themeShade="BF"/>
+        </w:rPr>
+        <w:t xml:space="preserve"> -c | sort -nr | head -20</w:t>
+      </w:r>
+    </w:p>
+    <w:p>
+      <w:r>
+        <w:pict w14:anchorId="2DF00B1F">
+          <v:rect id="_x0000_i1055" style="width:468pt;height:.85pt" o:hralign="center" o:hrstd="t" o:hr="t" fillcolor="#a0a0a0" stroked="f"/>
+        </w:pict>
+      </w:r>
+    </w:p>
+    <w:p>
+      <w:pPr>
+        <w:rPr>
+          <w:b/>
+          <w:bCs/>
+        </w:rPr>
+      </w:pPr>
+      <w:r>
+        <w:rPr>
+          <w:rFonts w:ascii="Segoe UI Emoji" w:hAnsi="Segoe UI Emoji" w:cs="Segoe UI Emoji"/>
+          <w:b/>
+          <w:bCs/>
+        </w:rPr>
+        <w:t>📜</w:t>
+      </w:r>
+      <w:r>
+        <w:rPr>
+          <w:b/>
+          <w:bCs/>
+        </w:rPr>
+        <w:t xml:space="preserve"> Step 4: Create Script to Monitor Bad IPs</w:t>
+      </w:r>
+    </w:p>
+    <w:p>
+      <w:proofErr w:type="spellStart"/>
+      <w:r>
+        <w:t>sudo</w:t>
+      </w:r>
+      <w:proofErr w:type="spellEnd"/>
+      <w:r>
+        <w:t xml:space="preserve"> nano /usr/local/bin/nginx-bad-ips.sh</w:t>
+      </w:r>
+    </w:p>
+    <w:p>
+      <w:proofErr w:type="gramStart"/>
+      <w:r>
+        <w:t>#!/</w:t>
+      </w:r>
+      <w:proofErr w:type="gramEnd"/>
+      <w:r>
+        <w:t>bin/bash</w:t>
+      </w:r>
+    </w:p>
+    <w:p>
+      <w:r>
+        <w:lastRenderedPageBreak/>
+        <w:t>echo "</w:t>
+      </w:r>
+      <w:r>
+        <w:rPr>
+          <w:rFonts w:ascii="Segoe UI Emoji" w:hAnsi="Segoe UI Emoji" w:cs="Segoe UI Emoji"/>
+        </w:rPr>
+        <w:t>🔍</w:t>
+      </w:r>
+      <w:r>
+        <w:t xml:space="preserve"> Top suspicious IPs from Nginx log:"</w:t>
+      </w:r>
+    </w:p>
+    <w:p>
+      <w:pPr>
+        <w:rPr>
+          <w:color w:val="BF4E14" w:themeColor="accent2" w:themeShade="BF"/>
+        </w:rPr>
+      </w:pPr>
+      <w:r>
+        <w:rPr>
+          <w:color w:val="BF4E14" w:themeColor="accent2" w:themeShade="BF"/>
+        </w:rPr>
+        <w:t>grep -E "</w:t>
+      </w:r>
+      <w:proofErr w:type="gramStart"/>
+      <w:r>
+        <w:rPr>
+          <w:color w:val="BF4E14" w:themeColor="accent2" w:themeShade="BF"/>
+        </w:rPr>
+        <w:t>GET .</w:t>
+      </w:r>
+      <w:proofErr w:type="gramEnd"/>
+      <w:r>
+        <w:rPr>
+          <w:color w:val="BF4E14" w:themeColor="accent2" w:themeShade="BF"/>
+        </w:rPr>
+        <w:t>*\.</w:t>
+      </w:r>
+      <w:proofErr w:type="spellStart"/>
+      <w:r>
+        <w:rPr>
+          <w:color w:val="BF4E14" w:themeColor="accent2" w:themeShade="BF"/>
+        </w:rPr>
+        <w:t>php|</w:t>
+      </w:r>
+      <w:proofErr w:type="gramStart"/>
+      <w:r>
+        <w:rPr>
+          <w:color w:val="BF4E14" w:themeColor="accent2" w:themeShade="BF"/>
+        </w:rPr>
+        <w:t>POST</w:t>
+      </w:r>
+      <w:proofErr w:type="spellEnd"/>
+      <w:r>
+        <w:rPr>
+          <w:color w:val="BF4E14" w:themeColor="accent2" w:themeShade="BF"/>
+        </w:rPr>
+        <w:t xml:space="preserve"> .</w:t>
+      </w:r>
+      <w:proofErr w:type="gramEnd"/>
+      <w:r>
+        <w:rPr>
+          <w:color w:val="BF4E14" w:themeColor="accent2" w:themeShade="BF"/>
+        </w:rPr>
+        <w:t>*\.</w:t>
+      </w:r>
+      <w:proofErr w:type="spellStart"/>
+      <w:r>
+        <w:rPr>
+          <w:color w:val="BF4E14" w:themeColor="accent2" w:themeShade="BF"/>
+        </w:rPr>
+        <w:t>php</w:t>
+      </w:r>
+      <w:proofErr w:type="spellEnd"/>
+      <w:r>
+        <w:rPr>
+          <w:color w:val="BF4E14" w:themeColor="accent2" w:themeShade="BF"/>
+        </w:rPr>
+        <w:t>" /var/log/nginx/access.log \</w:t>
+      </w:r>
+    </w:p>
+    <w:p>
+      <w:pPr>
+        <w:rPr>
+          <w:color w:val="BF4E14" w:themeColor="accent2" w:themeShade="BF"/>
+        </w:rPr>
+      </w:pPr>
+      <w:proofErr w:type="gramStart"/>
+      <w:r>
+        <w:rPr>
+          <w:color w:val="BF4E14" w:themeColor="accent2" w:themeShade="BF"/>
+        </w:rPr>
+        <w:t>| awk '{</w:t>
+      </w:r>
+      <w:proofErr w:type="gramEnd"/>
+      <w:r>
+        <w:rPr>
+          <w:color w:val="BF4E14" w:themeColor="accent2" w:themeShade="BF"/>
+        </w:rPr>
+        <w:t>print $</w:t>
+      </w:r>
+      <w:proofErr w:type="gramStart"/>
+      <w:r>
+        <w:rPr>
+          <w:color w:val="BF4E14" w:themeColor="accent2" w:themeShade="BF"/>
+        </w:rPr>
+        <w:t>1}' |</w:t>
+      </w:r>
+      <w:proofErr w:type="gramEnd"/>
+      <w:r>
+        <w:rPr>
+          <w:color w:val="BF4E14" w:themeColor="accent2" w:themeShade="BF"/>
+        </w:rPr>
+        <w:t xml:space="preserve"> sort | </w:t>
+      </w:r>
+      <w:proofErr w:type="spellStart"/>
+      <w:r>
+        <w:rPr>
+          <w:color w:val="BF4E14" w:themeColor="accent2" w:themeShade="BF"/>
+        </w:rPr>
+        <w:t>uniq</w:t>
+      </w:r>
+      <w:proofErr w:type="spellEnd"/>
+      <w:r>
+        <w:rPr>
+          <w:color w:val="BF4E14" w:themeColor="accent2" w:themeShade="BF"/>
+        </w:rPr>
+        <w:t xml:space="preserve"> -c | sort -nr | head -20</w:t>
+      </w:r>
+    </w:p>
+    <w:p>
+      <w:r>
+        <w:t>Make executable:</w:t>
+      </w:r>
+    </w:p>
+    <w:p>
+      <w:pPr>
+        <w:rPr>
+          <w:color w:val="BF4E14" w:themeColor="accent2" w:themeShade="BF"/>
+        </w:rPr>
+      </w:pPr>
+      <w:proofErr w:type="spellStart"/>
+      <w:r>
+        <w:rPr>
+          <w:color w:val="BF4E14" w:themeColor="accent2" w:themeShade="BF"/>
+        </w:rPr>
+        <w:t>sudo</w:t>
+      </w:r>
+      <w:proofErr w:type="spellEnd"/>
+      <w:r>
+        <w:rPr>
+          <w:color w:val="BF4E14" w:themeColor="accent2" w:themeShade="BF"/>
+        </w:rPr>
+        <w:t xml:space="preserve"> </w:t>
+      </w:r>
+      <w:proofErr w:type="spellStart"/>
+      <w:r>
+        <w:rPr>
+          <w:color w:val="BF4E14" w:themeColor="accent2" w:themeShade="BF"/>
+        </w:rPr>
+        <w:t>chmod</w:t>
+      </w:r>
+      <w:proofErr w:type="spellEnd"/>
+      <w:r>
+        <w:rPr>
+          <w:color w:val="BF4E14" w:themeColor="accent2" w:themeShade="BF"/>
+        </w:rPr>
+        <w:t xml:space="preserve"> +x /usr/local/bin/nginx-bad-ips.sh</w:t>
+      </w:r>
+    </w:p>
+    <w:p>
+      <w:r>
+        <w:t>Run with:</w:t>
+      </w:r>
+    </w:p>
+    <w:p>
+      <w:r>
+        <w:t>nginx-bad-ips.sh</w:t>
+      </w:r>
+    </w:p>
+    <w:p>
+      <w:r>
+        <w:pict w14:anchorId="6CE7642C">
+          <v:rect id="_x0000_i1056" style="width:468pt;height:.85pt" o:hralign="center" o:hrstd="t" o:hr="t" fillcolor="#a0a0a0" stroked="f"/>
+        </w:pict>
+      </w:r>
+    </w:p>
+    <w:p>
+      <w:pPr>
+        <w:rPr>
+          <w:b/>
+          <w:bCs/>
+        </w:rPr>
+      </w:pPr>
+      <w:r>
+        <w:rPr>
+          <w:rFonts w:ascii="Segoe UI Emoji" w:hAnsi="Segoe UI Emoji" w:cs="Segoe UI Emoji"/>
+          <w:b/>
+          <w:bCs/>
+        </w:rPr>
+        <w:t>🚫</w:t>
+      </w:r>
+      <w:r>
+        <w:rPr>
+          <w:b/>
+          <w:bCs/>
+        </w:rPr>
+        <w:t xml:space="preserve"> Step 5: Manually Ban Bad IPs (Optional)</w:t>
+      </w:r>
+    </w:p>
+    <w:p>
+      <w:r>
+        <w:t>If you see an attacker IP like 123.45.67.89:</w:t>
+      </w:r>
+    </w:p>
+    <w:p>
+      <w:pPr>
+        <w:ind w:left="720"/>
+        <w:rPr>
+          <w:color w:val="BF4E14" w:themeColor="accent2" w:themeShade="BF"/>
+        </w:rPr>
+      </w:pPr>
+      <w:proofErr w:type="spellStart"/>
+      <w:r>
+        <w:rPr>
+          <w:color w:val="BF4E14" w:themeColor="accent2" w:themeShade="BF"/>
+        </w:rPr>
+        <w:t>sudo</w:t>
+      </w:r>
+      <w:proofErr w:type="spellEnd"/>
+      <w:r>
+        <w:rPr>
+          <w:color w:val="BF4E14" w:themeColor="accent2" w:themeShade="BF"/>
+        </w:rPr>
+        <w:t xml:space="preserve"> </w:t>
+      </w:r>
+      <w:proofErr w:type="spellStart"/>
+      <w:r>
+        <w:rPr>
+          <w:color w:val="BF4E14" w:themeColor="accent2" w:themeShade="BF"/>
+        </w:rPr>
+        <w:t>ufw</w:t>
+      </w:r>
+      <w:proofErr w:type="spellEnd"/>
+      <w:r>
+        <w:rPr>
+          <w:color w:val="BF4E14" w:themeColor="accent2" w:themeShade="BF"/>
+        </w:rPr>
+        <w:t xml:space="preserve"> deny from 123.45.67.89</w:t>
+      </w:r>
+    </w:p>
+    <w:p>
+      <w:r>
+        <w:t xml:space="preserve">Unblock </w:t>
+      </w:r>
+      <w:proofErr w:type="gramStart"/>
+      <w:r>
+        <w:t>later</w:t>
+      </w:r>
+      <w:r>
+        <w:t xml:space="preserve">  if</w:t>
+      </w:r>
+      <w:proofErr w:type="gramEnd"/>
+      <w:r>
+        <w:t xml:space="preserve"> it is a false positive which means it is a good IP</w:t>
+      </w:r>
+      <w:r>
+        <w:t>:</w:t>
+      </w:r>
+    </w:p>
+    <w:p>
+      <w:pPr>
+        <w:ind w:left="720"/>
+        <w:rPr>
+          <w:color w:val="BF4E14" w:themeColor="accent2" w:themeShade="BF"/>
+        </w:rPr>
+      </w:pPr>
+      <w:proofErr w:type="spellStart"/>
+      <w:r>
+        <w:rPr>
+          <w:color w:val="BF4E14" w:themeColor="accent2" w:themeShade="BF"/>
+        </w:rPr>
+        <w:t>sudo</w:t>
+      </w:r>
+      <w:proofErr w:type="spellEnd"/>
+      <w:r>
+        <w:rPr>
+          <w:color w:val="BF4E14" w:themeColor="accent2" w:themeShade="BF"/>
+        </w:rPr>
+        <w:t xml:space="preserve"> </w:t>
+      </w:r>
+      <w:proofErr w:type="spellStart"/>
+      <w:r>
+        <w:rPr>
+          <w:color w:val="BF4E14" w:themeColor="accent2" w:themeShade="BF"/>
+        </w:rPr>
+        <w:t>ufw</w:t>
+      </w:r>
+      <w:proofErr w:type="spellEnd"/>
+      <w:r>
+        <w:rPr>
+          <w:color w:val="BF4E14" w:themeColor="accent2" w:themeShade="BF"/>
+        </w:rPr>
+        <w:t xml:space="preserve"> delete deny from 123.45.67.89</w:t>
+      </w:r>
+    </w:p>
+    <w:p>
+      <w:r>
+        <w:pict w14:anchorId="03FAE9DE">
           <v:rect id="_x0000_i1057" style="width:468pt;height:.85pt" o:hralign="center" o:hrstd="t" o:hr="t" fillcolor="#a0a0a0" stroked="f"/>
         </w:pict>
       </w:r>
@@ -22411,1491 +23897,60 @@
           <w:b/>
           <w:bCs/>
         </w:rPr>
-        <w:t>🔧</w:t>
-      </w:r>
-      <w:r>
-        <w:rPr>
-          <w:b/>
-          <w:bCs/>
-        </w:rPr>
-        <w:t xml:space="preserve"> Step 1: Install and Enable UFW (Firewall)</w:t>
-      </w:r>
-    </w:p>
-    <w:p>
+        <w:t>🔁</w:t>
+      </w:r>
+      <w:r>
+        <w:rPr>
+          <w:b/>
+          <w:bCs/>
+        </w:rPr>
+        <w:t xml:space="preserve"> Step 6: Monitor Live Attacks (Optional)</w:t>
+      </w:r>
+    </w:p>
+    <w:p>
+      <w:r>
+        <w:t>Watch real-time abuse attempts:</w:t>
+      </w:r>
+    </w:p>
+    <w:p>
+      <w:pPr>
+        <w:rPr>
+          <w:color w:val="BF4E14" w:themeColor="accent2" w:themeShade="BF"/>
+        </w:rPr>
+      </w:pPr>
       <w:proofErr w:type="spellStart"/>
       <w:r>
+        <w:rPr>
+          <w:color w:val="BF4E14" w:themeColor="accent2" w:themeShade="BF"/>
+        </w:rPr>
         <w:t>sudo</w:t>
       </w:r>
       <w:proofErr w:type="spellEnd"/>
       <w:r>
-        <w:t xml:space="preserve"> apt update</w:t>
-      </w:r>
-    </w:p>
-    <w:p>
+        <w:rPr>
+          <w:color w:val="BF4E14" w:themeColor="accent2" w:themeShade="BF"/>
+        </w:rPr>
+        <w:t xml:space="preserve"> tail -f /var/log/nginx/access.log | grep -Ei "</w:t>
+      </w:r>
       <w:proofErr w:type="spellStart"/>
       <w:r>
-        <w:t>sudo</w:t>
+        <w:rPr>
+          <w:color w:val="BF4E14" w:themeColor="accent2" w:themeShade="BF"/>
+        </w:rPr>
+        <w:t>php|wp-admin|wp-login|sql</w:t>
       </w:r>
       <w:proofErr w:type="spellEnd"/>
       <w:r>
-        <w:t xml:space="preserve"> apt install </w:t>
-      </w:r>
-      <w:proofErr w:type="spellStart"/>
-      <w:r>
-        <w:t>ufw</w:t>
-      </w:r>
-      <w:proofErr w:type="spellEnd"/>
-      <w:r>
-        <w:t xml:space="preserve"> -y</w:t>
-      </w:r>
-    </w:p>
-    <w:p/>
-    <w:p>
-      <w:r>
-        <w:t># Allow essential traffic</w:t>
-      </w:r>
-    </w:p>
-    <w:p>
-      <w:pPr>
         <w:rPr>
           <w:color w:val="BF4E14" w:themeColor="accent2" w:themeShade="BF"/>
         </w:rPr>
-      </w:pPr>
-      <w:proofErr w:type="spellStart"/>
-      <w:r>
-        <w:rPr>
-          <w:color w:val="BF4E14" w:themeColor="accent2" w:themeShade="BF"/>
-        </w:rPr>
-        <w:t>sudo</w:t>
-      </w:r>
-      <w:proofErr w:type="spellEnd"/>
-      <w:r>
-        <w:rPr>
-          <w:color w:val="BF4E14" w:themeColor="accent2" w:themeShade="BF"/>
-        </w:rPr>
-        <w:t xml:space="preserve"> </w:t>
-      </w:r>
-      <w:proofErr w:type="spellStart"/>
-      <w:r>
-        <w:rPr>
-          <w:color w:val="BF4E14" w:themeColor="accent2" w:themeShade="BF"/>
-        </w:rPr>
-        <w:t>ufw</w:t>
-      </w:r>
-      <w:proofErr w:type="spellEnd"/>
-      <w:r>
-        <w:rPr>
-          <w:color w:val="BF4E14" w:themeColor="accent2" w:themeShade="BF"/>
-        </w:rPr>
-        <w:t xml:space="preserve"> allow OpenSSH</w:t>
-      </w:r>
-    </w:p>
-    <w:p>
-      <w:pPr>
-        <w:rPr>
-          <w:color w:val="BF4E14" w:themeColor="accent2" w:themeShade="BF"/>
-        </w:rPr>
-      </w:pPr>
-      <w:proofErr w:type="spellStart"/>
-      <w:r>
-        <w:rPr>
-          <w:color w:val="BF4E14" w:themeColor="accent2" w:themeShade="BF"/>
-        </w:rPr>
-        <w:t>sudo</w:t>
-      </w:r>
-      <w:proofErr w:type="spellEnd"/>
-      <w:r>
-        <w:rPr>
-          <w:color w:val="BF4E14" w:themeColor="accent2" w:themeShade="BF"/>
-        </w:rPr>
-        <w:t xml:space="preserve"> </w:t>
-      </w:r>
-      <w:proofErr w:type="spellStart"/>
-      <w:r>
-        <w:rPr>
-          <w:color w:val="BF4E14" w:themeColor="accent2" w:themeShade="BF"/>
-        </w:rPr>
-        <w:t>ufw</w:t>
-      </w:r>
-      <w:proofErr w:type="spellEnd"/>
-      <w:r>
-        <w:rPr>
-          <w:color w:val="BF4E14" w:themeColor="accent2" w:themeShade="BF"/>
-        </w:rPr>
-        <w:t xml:space="preserve"> allow 'Nginx Full'</w:t>
-      </w:r>
-    </w:p>
-    <w:p/>
-    <w:p>
-      <w:r>
-        <w:t># Enable firewall</w:t>
-      </w:r>
-    </w:p>
-    <w:p>
-      <w:pPr>
-        <w:rPr>
-          <w:color w:val="BF4E14" w:themeColor="accent2" w:themeShade="BF"/>
-        </w:rPr>
-      </w:pPr>
-      <w:proofErr w:type="spellStart"/>
-      <w:r>
-        <w:rPr>
-          <w:color w:val="BF4E14" w:themeColor="accent2" w:themeShade="BF"/>
-        </w:rPr>
-        <w:t>sudo</w:t>
-      </w:r>
-      <w:proofErr w:type="spellEnd"/>
-      <w:r>
-        <w:rPr>
-          <w:color w:val="BF4E14" w:themeColor="accent2" w:themeShade="BF"/>
-        </w:rPr>
-        <w:t xml:space="preserve"> </w:t>
-      </w:r>
-      <w:proofErr w:type="spellStart"/>
-      <w:r>
-        <w:rPr>
-          <w:color w:val="BF4E14" w:themeColor="accent2" w:themeShade="BF"/>
-        </w:rPr>
-        <w:t>ufw</w:t>
-      </w:r>
-      <w:proofErr w:type="spellEnd"/>
-      <w:r>
-        <w:rPr>
-          <w:color w:val="BF4E14" w:themeColor="accent2" w:themeShade="BF"/>
-        </w:rPr>
-        <w:t xml:space="preserve"> enable</w:t>
-      </w:r>
-    </w:p>
-    <w:p>
-      <w:pPr>
-        <w:rPr>
-          <w:color w:val="BF4E14" w:themeColor="accent2" w:themeShade="BF"/>
-        </w:rPr>
-      </w:pPr>
-      <w:proofErr w:type="spellStart"/>
-      <w:r>
-        <w:rPr>
-          <w:color w:val="BF4E14" w:themeColor="accent2" w:themeShade="BF"/>
-        </w:rPr>
-        <w:t>sudo</w:t>
-      </w:r>
-      <w:proofErr w:type="spellEnd"/>
-      <w:r>
-        <w:rPr>
-          <w:color w:val="BF4E14" w:themeColor="accent2" w:themeShade="BF"/>
-        </w:rPr>
-        <w:t xml:space="preserve"> </w:t>
-      </w:r>
-      <w:proofErr w:type="spellStart"/>
-      <w:r>
-        <w:rPr>
-          <w:color w:val="BF4E14" w:themeColor="accent2" w:themeShade="BF"/>
-        </w:rPr>
-        <w:t>ufw</w:t>
-      </w:r>
-      <w:proofErr w:type="spellEnd"/>
-      <w:r>
-        <w:rPr>
-          <w:color w:val="BF4E14" w:themeColor="accent2" w:themeShade="BF"/>
-        </w:rPr>
-        <w:t xml:space="preserve"> status verbose</w:t>
-      </w:r>
-    </w:p>
-    <w:p>
-      <w:r>
-        <w:pict w14:anchorId="16803490">
+        <w:t>"</w:t>
+      </w:r>
+    </w:p>
+    <w:p>
+      <w:r>
+        <w:pict w14:anchorId="4BEAA31E">
           <v:rect id="_x0000_i1058" style="width:468pt;height:.85pt" o:hralign="center" o:hrstd="t" o:hr="t" fillcolor="#a0a0a0" stroked="f"/>
-        </w:pict>
-      </w:r>
-    </w:p>
-    <w:p>
-      <w:pPr>
-        <w:rPr>
-          <w:b/>
-          <w:bCs/>
-        </w:rPr>
-      </w:pPr>
-      <w:r>
-        <w:rPr>
-          <w:rFonts w:ascii="Segoe UI Emoji" w:hAnsi="Segoe UI Emoji" w:cs="Segoe UI Emoji"/>
-          <w:b/>
-          <w:bCs/>
-        </w:rPr>
-        <w:t>🛡️</w:t>
-      </w:r>
-      <w:r>
-        <w:rPr>
-          <w:b/>
-          <w:bCs/>
-        </w:rPr>
-        <w:t xml:space="preserve"> Step 2: Install and Configure Fail2Ban</w:t>
-      </w:r>
-    </w:p>
-    <w:p>
-      <w:pPr>
-        <w:rPr>
-          <w:color w:val="BF4E14" w:themeColor="accent2" w:themeShade="BF"/>
-        </w:rPr>
-      </w:pPr>
-      <w:proofErr w:type="spellStart"/>
-      <w:r>
-        <w:rPr>
-          <w:color w:val="BF4E14" w:themeColor="accent2" w:themeShade="BF"/>
-        </w:rPr>
-        <w:t>sudo</w:t>
-      </w:r>
-      <w:proofErr w:type="spellEnd"/>
-      <w:r>
-        <w:rPr>
-          <w:color w:val="BF4E14" w:themeColor="accent2" w:themeShade="BF"/>
-        </w:rPr>
-        <w:t xml:space="preserve"> apt install fail2ban -y</w:t>
-      </w:r>
-    </w:p>
-    <w:p>
-      <w:r>
-        <w:t>Then create a custom jail for Nginx:</w:t>
-      </w:r>
-    </w:p>
-    <w:p>
-      <w:pPr>
-        <w:rPr>
-          <w:color w:val="BF4E14" w:themeColor="accent2" w:themeShade="BF"/>
-        </w:rPr>
-      </w:pPr>
-      <w:proofErr w:type="spellStart"/>
-      <w:r>
-        <w:rPr>
-          <w:color w:val="BF4E14" w:themeColor="accent2" w:themeShade="BF"/>
-        </w:rPr>
-        <w:t>sudo</w:t>
-      </w:r>
-      <w:proofErr w:type="spellEnd"/>
-      <w:r>
-        <w:rPr>
-          <w:color w:val="BF4E14" w:themeColor="accent2" w:themeShade="BF"/>
-        </w:rPr>
-        <w:t xml:space="preserve"> nano /</w:t>
-      </w:r>
-      <w:proofErr w:type="spellStart"/>
-      <w:r>
-        <w:rPr>
-          <w:color w:val="BF4E14" w:themeColor="accent2" w:themeShade="BF"/>
-        </w:rPr>
-        <w:t>etc</w:t>
-      </w:r>
-      <w:proofErr w:type="spellEnd"/>
-      <w:r>
-        <w:rPr>
-          <w:color w:val="BF4E14" w:themeColor="accent2" w:themeShade="BF"/>
-        </w:rPr>
-        <w:t>/fail2ban/</w:t>
-      </w:r>
-      <w:proofErr w:type="spellStart"/>
-      <w:r>
-        <w:rPr>
-          <w:color w:val="BF4E14" w:themeColor="accent2" w:themeShade="BF"/>
-        </w:rPr>
-        <w:t>jail.d</w:t>
-      </w:r>
-      <w:proofErr w:type="spellEnd"/>
-      <w:r>
-        <w:rPr>
-          <w:color w:val="BF4E14" w:themeColor="accent2" w:themeShade="BF"/>
-        </w:rPr>
-        <w:t>/nginx-404.conf</w:t>
-      </w:r>
-    </w:p>
-    <w:p>
-      <w:r>
-        <w:t>Paste the following:</w:t>
-      </w:r>
-    </w:p>
-    <w:p>
-      <w:pPr>
-        <w:rPr>
-          <w:color w:val="BF4E14" w:themeColor="accent2" w:themeShade="BF"/>
-        </w:rPr>
-      </w:pPr>
-      <w:r>
-        <w:rPr>
-          <w:color w:val="BF4E14" w:themeColor="accent2" w:themeShade="BF"/>
-        </w:rPr>
-        <w:t>[nginx-404]</w:t>
-      </w:r>
-    </w:p>
-    <w:p>
-      <w:pPr>
-        <w:rPr>
-          <w:color w:val="BF4E14" w:themeColor="accent2" w:themeShade="BF"/>
-        </w:rPr>
-      </w:pPr>
-      <w:r>
-        <w:rPr>
-          <w:color w:val="BF4E14" w:themeColor="accent2" w:themeShade="BF"/>
-        </w:rPr>
-        <w:t>enabled = true</w:t>
-      </w:r>
-    </w:p>
-    <w:p>
-      <w:pPr>
-        <w:rPr>
-          <w:color w:val="BF4E14" w:themeColor="accent2" w:themeShade="BF"/>
-        </w:rPr>
-      </w:pPr>
-      <w:r>
-        <w:rPr>
-          <w:color w:val="BF4E14" w:themeColor="accent2" w:themeShade="BF"/>
-        </w:rPr>
-        <w:t xml:space="preserve">port = </w:t>
-      </w:r>
-      <w:proofErr w:type="spellStart"/>
-      <w:proofErr w:type="gramStart"/>
-      <w:r>
-        <w:rPr>
-          <w:color w:val="BF4E14" w:themeColor="accent2" w:themeShade="BF"/>
-        </w:rPr>
-        <w:t>http,https</w:t>
-      </w:r>
-      <w:proofErr w:type="spellEnd"/>
-      <w:proofErr w:type="gramEnd"/>
-    </w:p>
-    <w:p>
-      <w:pPr>
-        <w:rPr>
-          <w:color w:val="BF4E14" w:themeColor="accent2" w:themeShade="BF"/>
-        </w:rPr>
-      </w:pPr>
-      <w:r>
-        <w:rPr>
-          <w:color w:val="BF4E14" w:themeColor="accent2" w:themeShade="BF"/>
-        </w:rPr>
-        <w:t>filter = nginx-404</w:t>
-      </w:r>
-    </w:p>
-    <w:p>
-      <w:pPr>
-        <w:rPr>
-          <w:color w:val="BF4E14" w:themeColor="accent2" w:themeShade="BF"/>
-        </w:rPr>
-      </w:pPr>
-      <w:proofErr w:type="spellStart"/>
-      <w:r>
-        <w:rPr>
-          <w:color w:val="BF4E14" w:themeColor="accent2" w:themeShade="BF"/>
-        </w:rPr>
-        <w:t>logpath</w:t>
-      </w:r>
-      <w:proofErr w:type="spellEnd"/>
-      <w:r>
-        <w:rPr>
-          <w:color w:val="BF4E14" w:themeColor="accent2" w:themeShade="BF"/>
-        </w:rPr>
-        <w:t xml:space="preserve"> = /var/log/nginx/access.log</w:t>
-      </w:r>
-    </w:p>
-    <w:p>
-      <w:pPr>
-        <w:rPr>
-          <w:color w:val="BF4E14" w:themeColor="accent2" w:themeShade="BF"/>
-        </w:rPr>
-      </w:pPr>
-      <w:proofErr w:type="spellStart"/>
-      <w:r>
-        <w:rPr>
-          <w:color w:val="BF4E14" w:themeColor="accent2" w:themeShade="BF"/>
-        </w:rPr>
-        <w:t>maxretry</w:t>
-      </w:r>
-      <w:proofErr w:type="spellEnd"/>
-      <w:r>
-        <w:rPr>
-          <w:color w:val="BF4E14" w:themeColor="accent2" w:themeShade="BF"/>
-        </w:rPr>
-        <w:t xml:space="preserve"> = 5</w:t>
-      </w:r>
-    </w:p>
-    <w:p>
-      <w:pPr>
-        <w:rPr>
-          <w:color w:val="BF4E14" w:themeColor="accent2" w:themeShade="BF"/>
-        </w:rPr>
-      </w:pPr>
-      <w:proofErr w:type="spellStart"/>
-      <w:proofErr w:type="gramStart"/>
-      <w:r>
-        <w:rPr>
-          <w:color w:val="BF4E14" w:themeColor="accent2" w:themeShade="BF"/>
-        </w:rPr>
-        <w:lastRenderedPageBreak/>
-        <w:t>findtime</w:t>
-      </w:r>
-      <w:proofErr w:type="spellEnd"/>
-      <w:proofErr w:type="gramEnd"/>
-      <w:r>
-        <w:rPr>
-          <w:color w:val="BF4E14" w:themeColor="accent2" w:themeShade="BF"/>
-        </w:rPr>
-        <w:t xml:space="preserve"> = 600</w:t>
-      </w:r>
-    </w:p>
-    <w:p>
-      <w:pPr>
-        <w:rPr>
-          <w:color w:val="BF4E14" w:themeColor="accent2" w:themeShade="BF"/>
-        </w:rPr>
-      </w:pPr>
-      <w:proofErr w:type="spellStart"/>
-      <w:r>
-        <w:rPr>
-          <w:color w:val="BF4E14" w:themeColor="accent2" w:themeShade="BF"/>
-        </w:rPr>
-        <w:t>bantime</w:t>
-      </w:r>
-      <w:proofErr w:type="spellEnd"/>
-      <w:r>
-        <w:rPr>
-          <w:color w:val="BF4E14" w:themeColor="accent2" w:themeShade="BF"/>
-        </w:rPr>
-        <w:t xml:space="preserve"> = 86400</w:t>
-      </w:r>
-    </w:p>
-    <w:p>
-      <w:pPr>
-        <w:rPr>
-          <w:color w:val="BF4E14" w:themeColor="accent2" w:themeShade="BF"/>
-        </w:rPr>
-      </w:pPr>
-      <w:r>
-        <w:rPr>
-          <w:color w:val="BF4E14" w:themeColor="accent2" w:themeShade="BF"/>
-        </w:rPr>
-        <w:t>Now create the filter:</w:t>
-      </w:r>
-    </w:p>
-    <w:p>
-      <w:pPr>
-        <w:rPr>
-          <w:color w:val="BF4E14" w:themeColor="accent2" w:themeShade="BF"/>
-        </w:rPr>
-      </w:pPr>
-      <w:proofErr w:type="spellStart"/>
-      <w:r>
-        <w:rPr>
-          <w:color w:val="BF4E14" w:themeColor="accent2" w:themeShade="BF"/>
-        </w:rPr>
-        <w:t>sudo</w:t>
-      </w:r>
-      <w:proofErr w:type="spellEnd"/>
-      <w:r>
-        <w:rPr>
-          <w:color w:val="BF4E14" w:themeColor="accent2" w:themeShade="BF"/>
-        </w:rPr>
-        <w:t xml:space="preserve"> nano /</w:t>
-      </w:r>
-      <w:proofErr w:type="spellStart"/>
-      <w:r>
-        <w:rPr>
-          <w:color w:val="BF4E14" w:themeColor="accent2" w:themeShade="BF"/>
-        </w:rPr>
-        <w:t>etc</w:t>
-      </w:r>
-      <w:proofErr w:type="spellEnd"/>
-      <w:r>
-        <w:rPr>
-          <w:color w:val="BF4E14" w:themeColor="accent2" w:themeShade="BF"/>
-        </w:rPr>
-        <w:t>/fail2ban/</w:t>
-      </w:r>
-      <w:proofErr w:type="spellStart"/>
-      <w:r>
-        <w:rPr>
-          <w:color w:val="BF4E14" w:themeColor="accent2" w:themeShade="BF"/>
-        </w:rPr>
-        <w:t>filter.d</w:t>
-      </w:r>
-      <w:proofErr w:type="spellEnd"/>
-      <w:r>
-        <w:rPr>
-          <w:color w:val="BF4E14" w:themeColor="accent2" w:themeShade="BF"/>
-        </w:rPr>
-        <w:t>/nginx-404.conf</w:t>
-      </w:r>
-    </w:p>
-    <w:p>
-      <w:pPr>
-        <w:rPr>
-          <w:color w:val="BF4E14" w:themeColor="accent2" w:themeShade="BF"/>
-        </w:rPr>
-      </w:pPr>
-      <w:r>
-        <w:rPr>
-          <w:color w:val="BF4E14" w:themeColor="accent2" w:themeShade="BF"/>
-        </w:rPr>
-        <w:t>Add this pattern to detect repeated 404s and .</w:t>
-      </w:r>
-      <w:proofErr w:type="spellStart"/>
-      <w:r>
-        <w:rPr>
-          <w:color w:val="BF4E14" w:themeColor="accent2" w:themeShade="BF"/>
-        </w:rPr>
-        <w:t>php</w:t>
-      </w:r>
-      <w:proofErr w:type="spellEnd"/>
-      <w:r>
-        <w:rPr>
-          <w:color w:val="BF4E14" w:themeColor="accent2" w:themeShade="BF"/>
-        </w:rPr>
-        <w:t xml:space="preserve"> scans:</w:t>
-      </w:r>
-    </w:p>
-    <w:p>
-      <w:pPr>
-        <w:rPr>
-          <w:color w:val="BF4E14" w:themeColor="accent2" w:themeShade="BF"/>
-        </w:rPr>
-      </w:pPr>
-      <w:r>
-        <w:rPr>
-          <w:color w:val="BF4E14" w:themeColor="accent2" w:themeShade="BF"/>
-        </w:rPr>
-        <w:t>[Definition]</w:t>
-      </w:r>
-    </w:p>
-    <w:p>
-      <w:pPr>
-        <w:rPr>
-          <w:color w:val="BF4E14" w:themeColor="accent2" w:themeShade="BF"/>
-        </w:rPr>
-      </w:pPr>
-      <w:proofErr w:type="spellStart"/>
-      <w:r>
-        <w:rPr>
-          <w:color w:val="BF4E14" w:themeColor="accent2" w:themeShade="BF"/>
-        </w:rPr>
-        <w:t>failregex</w:t>
-      </w:r>
-      <w:proofErr w:type="spellEnd"/>
-      <w:r>
-        <w:rPr>
-          <w:color w:val="BF4E14" w:themeColor="accent2" w:themeShade="BF"/>
-        </w:rPr>
-        <w:t xml:space="preserve"> = &lt;HOST&gt; </w:t>
-      </w:r>
-      <w:proofErr w:type="gramStart"/>
-      <w:r>
-        <w:rPr>
-          <w:color w:val="BF4E14" w:themeColor="accent2" w:themeShade="BF"/>
-        </w:rPr>
-        <w:t>-.*</w:t>
-      </w:r>
-      <w:proofErr w:type="gramEnd"/>
-      <w:r>
-        <w:rPr>
-          <w:color w:val="BF4E14" w:themeColor="accent2" w:themeShade="BF"/>
-        </w:rPr>
-        <w:t>"(GET|POST</w:t>
-      </w:r>
-      <w:proofErr w:type="gramStart"/>
-      <w:r>
-        <w:rPr>
-          <w:color w:val="BF4E14" w:themeColor="accent2" w:themeShade="BF"/>
-        </w:rPr>
-        <w:t>) .</w:t>
-      </w:r>
-      <w:proofErr w:type="gramEnd"/>
-      <w:r>
-        <w:rPr>
-          <w:color w:val="BF4E14" w:themeColor="accent2" w:themeShade="BF"/>
-        </w:rPr>
-        <w:t>*\.</w:t>
-      </w:r>
-      <w:proofErr w:type="spellStart"/>
-      <w:r>
-        <w:rPr>
-          <w:color w:val="BF4E14" w:themeColor="accent2" w:themeShade="BF"/>
-        </w:rPr>
-        <w:t>php</w:t>
-      </w:r>
-      <w:proofErr w:type="spellEnd"/>
-      <w:r>
-        <w:rPr>
-          <w:color w:val="BF4E14" w:themeColor="accent2" w:themeShade="BF"/>
-        </w:rPr>
-        <w:t xml:space="preserve"> </w:t>
-      </w:r>
-      <w:proofErr w:type="gramStart"/>
-      <w:r>
-        <w:rPr>
-          <w:color w:val="BF4E14" w:themeColor="accent2" w:themeShade="BF"/>
-        </w:rPr>
-        <w:t>HTTP.*</w:t>
-      </w:r>
-      <w:proofErr w:type="gramEnd"/>
-      <w:r>
-        <w:rPr>
-          <w:color w:val="BF4E14" w:themeColor="accent2" w:themeShade="BF"/>
-        </w:rPr>
-        <w:t>" 404</w:t>
-      </w:r>
-    </w:p>
-    <w:p>
-      <w:pPr>
-        <w:rPr>
-          <w:color w:val="BF4E14" w:themeColor="accent2" w:themeShade="BF"/>
-        </w:rPr>
-      </w:pPr>
-      <w:r>
-        <w:rPr>
-          <w:color w:val="BF4E14" w:themeColor="accent2" w:themeShade="BF"/>
-        </w:rPr>
-        <w:t xml:space="preserve">         </w:t>
-      </w:r>
-      <w:r>
-        <w:rPr>
-          <w:color w:val="BF4E14" w:themeColor="accent2" w:themeShade="BF"/>
-        </w:rPr>
-        <w:t xml:space="preserve">           </w:t>
-      </w:r>
-      <w:r>
-        <w:rPr>
-          <w:color w:val="BF4E14" w:themeColor="accent2" w:themeShade="BF"/>
-        </w:rPr>
-        <w:t xml:space="preserve">   &lt;HOST&gt; </w:t>
-      </w:r>
-      <w:proofErr w:type="gramStart"/>
-      <w:r>
-        <w:rPr>
-          <w:color w:val="BF4E14" w:themeColor="accent2" w:themeShade="BF"/>
-        </w:rPr>
-        <w:t>-.*</w:t>
-      </w:r>
-      <w:proofErr w:type="gramEnd"/>
-      <w:r>
-        <w:rPr>
-          <w:color w:val="BF4E14" w:themeColor="accent2" w:themeShade="BF"/>
-        </w:rPr>
-        <w:t>"(GET|POST</w:t>
-      </w:r>
-      <w:proofErr w:type="gramStart"/>
-      <w:r>
-        <w:rPr>
-          <w:color w:val="BF4E14" w:themeColor="accent2" w:themeShade="BF"/>
-        </w:rPr>
-        <w:t>) .</w:t>
-      </w:r>
-      <w:proofErr w:type="gramEnd"/>
-      <w:r>
-        <w:rPr>
-          <w:color w:val="BF4E14" w:themeColor="accent2" w:themeShade="BF"/>
-        </w:rPr>
-        <w:t xml:space="preserve">* </w:t>
-      </w:r>
-      <w:proofErr w:type="gramStart"/>
-      <w:r>
-        <w:rPr>
-          <w:color w:val="BF4E14" w:themeColor="accent2" w:themeShade="BF"/>
-        </w:rPr>
-        <w:t>HTTP.*</w:t>
-      </w:r>
-      <w:proofErr w:type="gramEnd"/>
-      <w:r>
-        <w:rPr>
-          <w:color w:val="BF4E14" w:themeColor="accent2" w:themeShade="BF"/>
-        </w:rPr>
-        <w:t>" 404</w:t>
-      </w:r>
-    </w:p>
-    <w:p>
-      <w:pPr>
-        <w:rPr>
-          <w:color w:val="BF4E14" w:themeColor="accent2" w:themeShade="BF"/>
-        </w:rPr>
-      </w:pPr>
-      <w:proofErr w:type="spellStart"/>
-      <w:r>
-        <w:rPr>
-          <w:color w:val="BF4E14" w:themeColor="accent2" w:themeShade="BF"/>
-        </w:rPr>
-        <w:t>ignoreregex</w:t>
-      </w:r>
-      <w:proofErr w:type="spellEnd"/>
-      <w:r>
-        <w:rPr>
-          <w:color w:val="BF4E14" w:themeColor="accent2" w:themeShade="BF"/>
-        </w:rPr>
-        <w:t xml:space="preserve"> =</w:t>
-      </w:r>
-    </w:p>
-    <w:p>
-      <w:r>
-        <w:t>Then restart Fail2Ban:</w:t>
-      </w:r>
-    </w:p>
-    <w:p>
-      <w:pPr>
-        <w:rPr>
-          <w:color w:val="BF4E14" w:themeColor="accent2" w:themeShade="BF"/>
-        </w:rPr>
-      </w:pPr>
-      <w:proofErr w:type="spellStart"/>
-      <w:r>
-        <w:rPr>
-          <w:color w:val="BF4E14" w:themeColor="accent2" w:themeShade="BF"/>
-        </w:rPr>
-        <w:t>sudo</w:t>
-      </w:r>
-      <w:proofErr w:type="spellEnd"/>
-      <w:r>
-        <w:rPr>
-          <w:color w:val="BF4E14" w:themeColor="accent2" w:themeShade="BF"/>
-        </w:rPr>
-        <w:t xml:space="preserve"> </w:t>
-      </w:r>
-      <w:proofErr w:type="spellStart"/>
-      <w:r>
-        <w:rPr>
-          <w:color w:val="BF4E14" w:themeColor="accent2" w:themeShade="BF"/>
-        </w:rPr>
-        <w:t>systemctl</w:t>
-      </w:r>
-      <w:proofErr w:type="spellEnd"/>
-      <w:r>
-        <w:rPr>
-          <w:color w:val="BF4E14" w:themeColor="accent2" w:themeShade="BF"/>
-        </w:rPr>
-        <w:t xml:space="preserve"> restart fail2ban</w:t>
-      </w:r>
-    </w:p>
-    <w:p>
-      <w:pPr>
-        <w:rPr>
-          <w:color w:val="BF4E14" w:themeColor="accent2" w:themeShade="BF"/>
-        </w:rPr>
-      </w:pPr>
-      <w:proofErr w:type="spellStart"/>
-      <w:r>
-        <w:rPr>
-          <w:color w:val="BF4E14" w:themeColor="accent2" w:themeShade="BF"/>
-        </w:rPr>
-        <w:t>sudo</w:t>
-      </w:r>
-      <w:proofErr w:type="spellEnd"/>
-      <w:r>
-        <w:rPr>
-          <w:color w:val="BF4E14" w:themeColor="accent2" w:themeShade="BF"/>
-        </w:rPr>
-        <w:t xml:space="preserve"> </w:t>
-      </w:r>
-      <w:proofErr w:type="spellStart"/>
-      <w:r>
-        <w:rPr>
-          <w:color w:val="BF4E14" w:themeColor="accent2" w:themeShade="BF"/>
-        </w:rPr>
-        <w:t>systemctl</w:t>
-      </w:r>
-      <w:proofErr w:type="spellEnd"/>
-      <w:r>
-        <w:rPr>
-          <w:color w:val="BF4E14" w:themeColor="accent2" w:themeShade="BF"/>
-        </w:rPr>
-        <w:t xml:space="preserve"> enable fail2ban</w:t>
-      </w:r>
-    </w:p>
-    <w:p>
-      <w:r>
-        <w:rPr>
-          <w:rFonts w:ascii="Segoe UI Emoji" w:hAnsi="Segoe UI Emoji" w:cs="Segoe UI Emoji"/>
-        </w:rPr>
-        <w:t>✅</w:t>
-      </w:r>
-      <w:r>
-        <w:t xml:space="preserve"> Check status:</w:t>
-      </w:r>
-    </w:p>
-    <w:p>
-      <w:pPr>
-        <w:rPr>
-          <w:color w:val="BF4E14" w:themeColor="accent2" w:themeShade="BF"/>
-        </w:rPr>
-      </w:pPr>
-      <w:proofErr w:type="spellStart"/>
-      <w:r>
-        <w:rPr>
-          <w:color w:val="BF4E14" w:themeColor="accent2" w:themeShade="BF"/>
-        </w:rPr>
-        <w:t>sudo</w:t>
-      </w:r>
-      <w:proofErr w:type="spellEnd"/>
-      <w:r>
-        <w:rPr>
-          <w:color w:val="BF4E14" w:themeColor="accent2" w:themeShade="BF"/>
-        </w:rPr>
-        <w:t xml:space="preserve"> fail2ban-client status nginx-404</w:t>
-      </w:r>
-    </w:p>
-    <w:p>
-      <w:r>
-        <w:pict w14:anchorId="4F6D44AA">
-          <v:rect id="_x0000_i1059" style="width:468pt;height:.85pt" o:hralign="center" o:hrstd="t" o:hr="t" fillcolor="#a0a0a0" stroked="f"/>
-        </w:pict>
-      </w:r>
-    </w:p>
-    <w:p>
-      <w:pPr>
-        <w:rPr>
-          <w:b/>
-          <w:bCs/>
-        </w:rPr>
-      </w:pPr>
-      <w:r>
-        <w:rPr>
-          <w:rFonts w:ascii="Segoe UI Emoji" w:hAnsi="Segoe UI Emoji" w:cs="Segoe UI Emoji"/>
-          <w:b/>
-          <w:bCs/>
-        </w:rPr>
-        <w:t>🔍</w:t>
-      </w:r>
-      <w:r>
-        <w:rPr>
-          <w:b/>
-          <w:bCs/>
-        </w:rPr>
-        <w:t xml:space="preserve"> Step 3: Detect Suspicious IPs from Nginx Logs</w:t>
-      </w:r>
-    </w:p>
-    <w:p>
-      <w:r>
-        <w:t>To find top IPs scanning for .</w:t>
-      </w:r>
-      <w:proofErr w:type="spellStart"/>
-      <w:r>
-        <w:t>php</w:t>
-      </w:r>
-      <w:proofErr w:type="spellEnd"/>
-      <w:r>
-        <w:t xml:space="preserve"> files or triggering 404s:</w:t>
-      </w:r>
-    </w:p>
-    <w:p>
-      <w:pPr>
-        <w:rPr>
-          <w:color w:val="BF4E14" w:themeColor="accent2" w:themeShade="BF"/>
-        </w:rPr>
-      </w:pPr>
-      <w:proofErr w:type="spellStart"/>
-      <w:r>
-        <w:rPr>
-          <w:color w:val="BF4E14" w:themeColor="accent2" w:themeShade="BF"/>
-        </w:rPr>
-        <w:t>sudo</w:t>
-      </w:r>
-      <w:proofErr w:type="spellEnd"/>
-      <w:r>
-        <w:rPr>
-          <w:color w:val="BF4E14" w:themeColor="accent2" w:themeShade="BF"/>
-        </w:rPr>
-        <w:t xml:space="preserve"> grep -E "</w:t>
-      </w:r>
-      <w:proofErr w:type="gramStart"/>
-      <w:r>
-        <w:rPr>
-          <w:color w:val="BF4E14" w:themeColor="accent2" w:themeShade="BF"/>
-        </w:rPr>
-        <w:t>GET .</w:t>
-      </w:r>
-      <w:proofErr w:type="gramEnd"/>
-      <w:r>
-        <w:rPr>
-          <w:color w:val="BF4E14" w:themeColor="accent2" w:themeShade="BF"/>
-        </w:rPr>
-        <w:t>*\.</w:t>
-      </w:r>
-      <w:proofErr w:type="spellStart"/>
-      <w:r>
-        <w:rPr>
-          <w:color w:val="BF4E14" w:themeColor="accent2" w:themeShade="BF"/>
-        </w:rPr>
-        <w:t>php|</w:t>
-      </w:r>
-      <w:proofErr w:type="gramStart"/>
-      <w:r>
-        <w:rPr>
-          <w:color w:val="BF4E14" w:themeColor="accent2" w:themeShade="BF"/>
-        </w:rPr>
-        <w:t>POST</w:t>
-      </w:r>
-      <w:proofErr w:type="spellEnd"/>
-      <w:r>
-        <w:rPr>
-          <w:color w:val="BF4E14" w:themeColor="accent2" w:themeShade="BF"/>
-        </w:rPr>
-        <w:t xml:space="preserve"> .</w:t>
-      </w:r>
-      <w:proofErr w:type="gramEnd"/>
-      <w:r>
-        <w:rPr>
-          <w:color w:val="BF4E14" w:themeColor="accent2" w:themeShade="BF"/>
-        </w:rPr>
-        <w:t>*\.</w:t>
-      </w:r>
-      <w:proofErr w:type="spellStart"/>
-      <w:r>
-        <w:rPr>
-          <w:color w:val="BF4E14" w:themeColor="accent2" w:themeShade="BF"/>
-        </w:rPr>
-        <w:t>php</w:t>
-      </w:r>
-      <w:proofErr w:type="spellEnd"/>
-      <w:r>
-        <w:rPr>
-          <w:color w:val="BF4E14" w:themeColor="accent2" w:themeShade="BF"/>
-        </w:rPr>
-        <w:t>" /var/log/nginx/access.log \</w:t>
-      </w:r>
-    </w:p>
-    <w:p>
-      <w:pPr>
-        <w:rPr>
-          <w:color w:val="BF4E14" w:themeColor="accent2" w:themeShade="BF"/>
-        </w:rPr>
-      </w:pPr>
-      <w:proofErr w:type="gramStart"/>
-      <w:r>
-        <w:rPr>
-          <w:color w:val="BF4E14" w:themeColor="accent2" w:themeShade="BF"/>
-        </w:rPr>
-        <w:t>| awk '{</w:t>
-      </w:r>
-      <w:proofErr w:type="gramEnd"/>
-      <w:r>
-        <w:rPr>
-          <w:color w:val="BF4E14" w:themeColor="accent2" w:themeShade="BF"/>
-        </w:rPr>
-        <w:t>print $</w:t>
-      </w:r>
-      <w:proofErr w:type="gramStart"/>
-      <w:r>
-        <w:rPr>
-          <w:color w:val="BF4E14" w:themeColor="accent2" w:themeShade="BF"/>
-        </w:rPr>
-        <w:t>1}' |</w:t>
-      </w:r>
-      <w:proofErr w:type="gramEnd"/>
-      <w:r>
-        <w:rPr>
-          <w:color w:val="BF4E14" w:themeColor="accent2" w:themeShade="BF"/>
-        </w:rPr>
-        <w:t xml:space="preserve"> sort | </w:t>
-      </w:r>
-      <w:proofErr w:type="spellStart"/>
-      <w:r>
-        <w:rPr>
-          <w:color w:val="BF4E14" w:themeColor="accent2" w:themeShade="BF"/>
-        </w:rPr>
-        <w:t>uniq</w:t>
-      </w:r>
-      <w:proofErr w:type="spellEnd"/>
-      <w:r>
-        <w:rPr>
-          <w:color w:val="BF4E14" w:themeColor="accent2" w:themeShade="BF"/>
-        </w:rPr>
-        <w:t xml:space="preserve"> -c | sort -nr | head -20</w:t>
-      </w:r>
-    </w:p>
-    <w:p>
-      <w:r>
-        <w:rPr>
-          <w:rFonts w:ascii="Segoe UI Emoji" w:hAnsi="Segoe UI Emoji" w:cs="Segoe UI Emoji"/>
-        </w:rPr>
-        <w:t>✅</w:t>
-      </w:r>
-      <w:r>
-        <w:t xml:space="preserve"> Optional: Check for all 404s:</w:t>
-      </w:r>
-    </w:p>
-    <w:p>
-      <w:pPr>
-        <w:rPr>
-          <w:color w:val="BF4E14" w:themeColor="accent2" w:themeShade="BF"/>
-        </w:rPr>
-      </w:pPr>
-      <w:proofErr w:type="spellStart"/>
-      <w:r>
-        <w:rPr>
-          <w:color w:val="BF4E14" w:themeColor="accent2" w:themeShade="BF"/>
-        </w:rPr>
-        <w:t>sudo</w:t>
-      </w:r>
-      <w:proofErr w:type="spellEnd"/>
-      <w:r>
-        <w:rPr>
-          <w:color w:val="BF4E14" w:themeColor="accent2" w:themeShade="BF"/>
-        </w:rPr>
-        <w:t xml:space="preserve"> grep ' 404 ' /var/log/nginx/access.log | awk '{print $</w:t>
-      </w:r>
-      <w:proofErr w:type="gramStart"/>
-      <w:r>
-        <w:rPr>
-          <w:color w:val="BF4E14" w:themeColor="accent2" w:themeShade="BF"/>
-        </w:rPr>
-        <w:t>1}' |</w:t>
-      </w:r>
-      <w:proofErr w:type="gramEnd"/>
-      <w:r>
-        <w:rPr>
-          <w:color w:val="BF4E14" w:themeColor="accent2" w:themeShade="BF"/>
-        </w:rPr>
-        <w:t xml:space="preserve"> sort | </w:t>
-      </w:r>
-      <w:proofErr w:type="spellStart"/>
-      <w:r>
-        <w:rPr>
-          <w:color w:val="BF4E14" w:themeColor="accent2" w:themeShade="BF"/>
-        </w:rPr>
-        <w:t>uniq</w:t>
-      </w:r>
-      <w:proofErr w:type="spellEnd"/>
-      <w:r>
-        <w:rPr>
-          <w:color w:val="BF4E14" w:themeColor="accent2" w:themeShade="BF"/>
-        </w:rPr>
-        <w:t xml:space="preserve"> -c | sort -nr | head -20</w:t>
-      </w:r>
-    </w:p>
-    <w:p>
-      <w:r>
-        <w:pict w14:anchorId="2DF00B1F">
-          <v:rect id="_x0000_i1060" style="width:468pt;height:.85pt" o:hralign="center" o:hrstd="t" o:hr="t" fillcolor="#a0a0a0" stroked="f"/>
-        </w:pict>
-      </w:r>
-    </w:p>
-    <w:p>
-      <w:pPr>
-        <w:rPr>
-          <w:b/>
-          <w:bCs/>
-        </w:rPr>
-      </w:pPr>
-      <w:r>
-        <w:rPr>
-          <w:rFonts w:ascii="Segoe UI Emoji" w:hAnsi="Segoe UI Emoji" w:cs="Segoe UI Emoji"/>
-          <w:b/>
-          <w:bCs/>
-        </w:rPr>
-        <w:t>📜</w:t>
-      </w:r>
-      <w:r>
-        <w:rPr>
-          <w:b/>
-          <w:bCs/>
-        </w:rPr>
-        <w:t xml:space="preserve"> Step 4: Create Script to Monitor Bad IPs</w:t>
-      </w:r>
-    </w:p>
-    <w:p>
-      <w:proofErr w:type="spellStart"/>
-      <w:r>
-        <w:t>sudo</w:t>
-      </w:r>
-      <w:proofErr w:type="spellEnd"/>
-      <w:r>
-        <w:t xml:space="preserve"> nano /usr/local/bin/nginx-bad-ips.sh</w:t>
-      </w:r>
-    </w:p>
-    <w:p>
-      <w:proofErr w:type="gramStart"/>
-      <w:r>
-        <w:t>#!/</w:t>
-      </w:r>
-      <w:proofErr w:type="gramEnd"/>
-      <w:r>
-        <w:t>bin/bash</w:t>
-      </w:r>
-    </w:p>
-    <w:p>
-      <w:r>
-        <w:lastRenderedPageBreak/>
-        <w:t>echo "</w:t>
-      </w:r>
-      <w:r>
-        <w:rPr>
-          <w:rFonts w:ascii="Segoe UI Emoji" w:hAnsi="Segoe UI Emoji" w:cs="Segoe UI Emoji"/>
-        </w:rPr>
-        <w:t>🔍</w:t>
-      </w:r>
-      <w:r>
-        <w:t xml:space="preserve"> Top suspicious IPs from Nginx log:"</w:t>
-      </w:r>
-    </w:p>
-    <w:p>
-      <w:pPr>
-        <w:rPr>
-          <w:color w:val="BF4E14" w:themeColor="accent2" w:themeShade="BF"/>
-        </w:rPr>
-      </w:pPr>
-      <w:r>
-        <w:rPr>
-          <w:color w:val="BF4E14" w:themeColor="accent2" w:themeShade="BF"/>
-        </w:rPr>
-        <w:t>grep -E "</w:t>
-      </w:r>
-      <w:proofErr w:type="gramStart"/>
-      <w:r>
-        <w:rPr>
-          <w:color w:val="BF4E14" w:themeColor="accent2" w:themeShade="BF"/>
-        </w:rPr>
-        <w:t>GET .</w:t>
-      </w:r>
-      <w:proofErr w:type="gramEnd"/>
-      <w:r>
-        <w:rPr>
-          <w:color w:val="BF4E14" w:themeColor="accent2" w:themeShade="BF"/>
-        </w:rPr>
-        <w:t>*\.</w:t>
-      </w:r>
-      <w:proofErr w:type="spellStart"/>
-      <w:r>
-        <w:rPr>
-          <w:color w:val="BF4E14" w:themeColor="accent2" w:themeShade="BF"/>
-        </w:rPr>
-        <w:t>php|</w:t>
-      </w:r>
-      <w:proofErr w:type="gramStart"/>
-      <w:r>
-        <w:rPr>
-          <w:color w:val="BF4E14" w:themeColor="accent2" w:themeShade="BF"/>
-        </w:rPr>
-        <w:t>POST</w:t>
-      </w:r>
-      <w:proofErr w:type="spellEnd"/>
-      <w:r>
-        <w:rPr>
-          <w:color w:val="BF4E14" w:themeColor="accent2" w:themeShade="BF"/>
-        </w:rPr>
-        <w:t xml:space="preserve"> .</w:t>
-      </w:r>
-      <w:proofErr w:type="gramEnd"/>
-      <w:r>
-        <w:rPr>
-          <w:color w:val="BF4E14" w:themeColor="accent2" w:themeShade="BF"/>
-        </w:rPr>
-        <w:t>*\.</w:t>
-      </w:r>
-      <w:proofErr w:type="spellStart"/>
-      <w:r>
-        <w:rPr>
-          <w:color w:val="BF4E14" w:themeColor="accent2" w:themeShade="BF"/>
-        </w:rPr>
-        <w:t>php</w:t>
-      </w:r>
-      <w:proofErr w:type="spellEnd"/>
-      <w:r>
-        <w:rPr>
-          <w:color w:val="BF4E14" w:themeColor="accent2" w:themeShade="BF"/>
-        </w:rPr>
-        <w:t>" /var/log/nginx/access.log \</w:t>
-      </w:r>
-    </w:p>
-    <w:p>
-      <w:pPr>
-        <w:rPr>
-          <w:color w:val="BF4E14" w:themeColor="accent2" w:themeShade="BF"/>
-        </w:rPr>
-      </w:pPr>
-      <w:proofErr w:type="gramStart"/>
-      <w:r>
-        <w:rPr>
-          <w:color w:val="BF4E14" w:themeColor="accent2" w:themeShade="BF"/>
-        </w:rPr>
-        <w:t>| awk '{</w:t>
-      </w:r>
-      <w:proofErr w:type="gramEnd"/>
-      <w:r>
-        <w:rPr>
-          <w:color w:val="BF4E14" w:themeColor="accent2" w:themeShade="BF"/>
-        </w:rPr>
-        <w:t>print $</w:t>
-      </w:r>
-      <w:proofErr w:type="gramStart"/>
-      <w:r>
-        <w:rPr>
-          <w:color w:val="BF4E14" w:themeColor="accent2" w:themeShade="BF"/>
-        </w:rPr>
-        <w:t>1}' |</w:t>
-      </w:r>
-      <w:proofErr w:type="gramEnd"/>
-      <w:r>
-        <w:rPr>
-          <w:color w:val="BF4E14" w:themeColor="accent2" w:themeShade="BF"/>
-        </w:rPr>
-        <w:t xml:space="preserve"> sort | </w:t>
-      </w:r>
-      <w:proofErr w:type="spellStart"/>
-      <w:r>
-        <w:rPr>
-          <w:color w:val="BF4E14" w:themeColor="accent2" w:themeShade="BF"/>
-        </w:rPr>
-        <w:t>uniq</w:t>
-      </w:r>
-      <w:proofErr w:type="spellEnd"/>
-      <w:r>
-        <w:rPr>
-          <w:color w:val="BF4E14" w:themeColor="accent2" w:themeShade="BF"/>
-        </w:rPr>
-        <w:t xml:space="preserve"> -c | sort -nr | head -20</w:t>
-      </w:r>
-    </w:p>
-    <w:p>
-      <w:r>
-        <w:t>Make executable:</w:t>
-      </w:r>
-    </w:p>
-    <w:p>
-      <w:pPr>
-        <w:rPr>
-          <w:color w:val="BF4E14" w:themeColor="accent2" w:themeShade="BF"/>
-        </w:rPr>
-      </w:pPr>
-      <w:proofErr w:type="spellStart"/>
-      <w:r>
-        <w:rPr>
-          <w:color w:val="BF4E14" w:themeColor="accent2" w:themeShade="BF"/>
-        </w:rPr>
-        <w:t>sudo</w:t>
-      </w:r>
-      <w:proofErr w:type="spellEnd"/>
-      <w:r>
-        <w:rPr>
-          <w:color w:val="BF4E14" w:themeColor="accent2" w:themeShade="BF"/>
-        </w:rPr>
-        <w:t xml:space="preserve"> </w:t>
-      </w:r>
-      <w:proofErr w:type="spellStart"/>
-      <w:r>
-        <w:rPr>
-          <w:color w:val="BF4E14" w:themeColor="accent2" w:themeShade="BF"/>
-        </w:rPr>
-        <w:t>chmod</w:t>
-      </w:r>
-      <w:proofErr w:type="spellEnd"/>
-      <w:r>
-        <w:rPr>
-          <w:color w:val="BF4E14" w:themeColor="accent2" w:themeShade="BF"/>
-        </w:rPr>
-        <w:t xml:space="preserve"> +x /usr/local/bin/nginx-bad-ips.sh</w:t>
-      </w:r>
-    </w:p>
-    <w:p>
-      <w:r>
-        <w:t>Run with:</w:t>
-      </w:r>
-    </w:p>
-    <w:p>
-      <w:r>
-        <w:t>nginx-bad-ips.sh</w:t>
-      </w:r>
-    </w:p>
-    <w:p>
-      <w:r>
-        <w:pict w14:anchorId="6CE7642C">
-          <v:rect id="_x0000_i1061" style="width:468pt;height:.85pt" o:hralign="center" o:hrstd="t" o:hr="t" fillcolor="#a0a0a0" stroked="f"/>
-        </w:pict>
-      </w:r>
-    </w:p>
-    <w:p>
-      <w:pPr>
-        <w:rPr>
-          <w:b/>
-          <w:bCs/>
-        </w:rPr>
-      </w:pPr>
-      <w:r>
-        <w:rPr>
-          <w:rFonts w:ascii="Segoe UI Emoji" w:hAnsi="Segoe UI Emoji" w:cs="Segoe UI Emoji"/>
-          <w:b/>
-          <w:bCs/>
-        </w:rPr>
-        <w:t>🚫</w:t>
-      </w:r>
-      <w:r>
-        <w:rPr>
-          <w:b/>
-          <w:bCs/>
-        </w:rPr>
-        <w:t xml:space="preserve"> Step 5: Manually Ban Bad IPs (Optional)</w:t>
-      </w:r>
-    </w:p>
-    <w:p>
-      <w:r>
-        <w:t>If you see an attacker IP like 123.45.67.89:</w:t>
-      </w:r>
-    </w:p>
-    <w:p>
-      <w:pPr>
-        <w:ind w:left="720"/>
-        <w:rPr>
-          <w:color w:val="BF4E14" w:themeColor="accent2" w:themeShade="BF"/>
-        </w:rPr>
-      </w:pPr>
-      <w:proofErr w:type="spellStart"/>
-      <w:r>
-        <w:rPr>
-          <w:color w:val="BF4E14" w:themeColor="accent2" w:themeShade="BF"/>
-        </w:rPr>
-        <w:t>sudo</w:t>
-      </w:r>
-      <w:proofErr w:type="spellEnd"/>
-      <w:r>
-        <w:rPr>
-          <w:color w:val="BF4E14" w:themeColor="accent2" w:themeShade="BF"/>
-        </w:rPr>
-        <w:t xml:space="preserve"> </w:t>
-      </w:r>
-      <w:proofErr w:type="spellStart"/>
-      <w:r>
-        <w:rPr>
-          <w:color w:val="BF4E14" w:themeColor="accent2" w:themeShade="BF"/>
-        </w:rPr>
-        <w:t>ufw</w:t>
-      </w:r>
-      <w:proofErr w:type="spellEnd"/>
-      <w:r>
-        <w:rPr>
-          <w:color w:val="BF4E14" w:themeColor="accent2" w:themeShade="BF"/>
-        </w:rPr>
-        <w:t xml:space="preserve"> deny from 123.45.67.89</w:t>
-      </w:r>
-    </w:p>
-    <w:p>
-      <w:r>
-        <w:t xml:space="preserve">Unblock </w:t>
-      </w:r>
-      <w:proofErr w:type="gramStart"/>
-      <w:r>
-        <w:t>later</w:t>
-      </w:r>
-      <w:r>
-        <w:t xml:space="preserve">  if</w:t>
-      </w:r>
-      <w:proofErr w:type="gramEnd"/>
-      <w:r>
-        <w:t xml:space="preserve"> it is a false positive which means it is a good IP</w:t>
-      </w:r>
-      <w:r>
-        <w:t>:</w:t>
-      </w:r>
-    </w:p>
-    <w:p>
-      <w:pPr>
-        <w:ind w:left="720"/>
-        <w:rPr>
-          <w:color w:val="BF4E14" w:themeColor="accent2" w:themeShade="BF"/>
-        </w:rPr>
-      </w:pPr>
-      <w:proofErr w:type="spellStart"/>
-      <w:r>
-        <w:rPr>
-          <w:color w:val="BF4E14" w:themeColor="accent2" w:themeShade="BF"/>
-        </w:rPr>
-        <w:t>sudo</w:t>
-      </w:r>
-      <w:proofErr w:type="spellEnd"/>
-      <w:r>
-        <w:rPr>
-          <w:color w:val="BF4E14" w:themeColor="accent2" w:themeShade="BF"/>
-        </w:rPr>
-        <w:t xml:space="preserve"> </w:t>
-      </w:r>
-      <w:proofErr w:type="spellStart"/>
-      <w:r>
-        <w:rPr>
-          <w:color w:val="BF4E14" w:themeColor="accent2" w:themeShade="BF"/>
-        </w:rPr>
-        <w:t>ufw</w:t>
-      </w:r>
-      <w:proofErr w:type="spellEnd"/>
-      <w:r>
-        <w:rPr>
-          <w:color w:val="BF4E14" w:themeColor="accent2" w:themeShade="BF"/>
-        </w:rPr>
-        <w:t xml:space="preserve"> delete deny from 123.45.67.89</w:t>
-      </w:r>
-    </w:p>
-    <w:p>
-      <w:r>
-        <w:pict w14:anchorId="03FAE9DE">
-          <v:rect id="_x0000_i1062" style="width:468pt;height:.85pt" o:hralign="center" o:hrstd="t" o:hr="t" fillcolor="#a0a0a0" stroked="f"/>
-        </w:pict>
-      </w:r>
-    </w:p>
-    <w:p>
-      <w:pPr>
-        <w:rPr>
-          <w:b/>
-          <w:bCs/>
-        </w:rPr>
-      </w:pPr>
-      <w:r>
-        <w:rPr>
-          <w:rFonts w:ascii="Segoe UI Emoji" w:hAnsi="Segoe UI Emoji" w:cs="Segoe UI Emoji"/>
-          <w:b/>
-          <w:bCs/>
-        </w:rPr>
-        <w:t>🔁</w:t>
-      </w:r>
-      <w:r>
-        <w:rPr>
-          <w:b/>
-          <w:bCs/>
-        </w:rPr>
-        <w:t xml:space="preserve"> Step 6: Monitor Live Attacks (Optional)</w:t>
-      </w:r>
-    </w:p>
-    <w:p>
-      <w:r>
-        <w:t>Watch real-time abuse attempts:</w:t>
-      </w:r>
-    </w:p>
-    <w:p>
-      <w:pPr>
-        <w:rPr>
-          <w:color w:val="BF4E14" w:themeColor="accent2" w:themeShade="BF"/>
-        </w:rPr>
-      </w:pPr>
-      <w:proofErr w:type="spellStart"/>
-      <w:r>
-        <w:rPr>
-          <w:color w:val="BF4E14" w:themeColor="accent2" w:themeShade="BF"/>
-        </w:rPr>
-        <w:t>sudo</w:t>
-      </w:r>
-      <w:proofErr w:type="spellEnd"/>
-      <w:r>
-        <w:rPr>
-          <w:color w:val="BF4E14" w:themeColor="accent2" w:themeShade="BF"/>
-        </w:rPr>
-        <w:t xml:space="preserve"> tail -f /var/log/nginx/access.log | grep -Ei "</w:t>
-      </w:r>
-      <w:proofErr w:type="spellStart"/>
-      <w:r>
-        <w:rPr>
-          <w:color w:val="BF4E14" w:themeColor="accent2" w:themeShade="BF"/>
-        </w:rPr>
-        <w:t>php|wp-admin|wp-login|sql</w:t>
-      </w:r>
-      <w:proofErr w:type="spellEnd"/>
-      <w:r>
-        <w:rPr>
-          <w:color w:val="BF4E14" w:themeColor="accent2" w:themeShade="BF"/>
-        </w:rPr>
-        <w:t>"</w:t>
-      </w:r>
-    </w:p>
-    <w:p>
-      <w:r>
-        <w:pict w14:anchorId="4BEAA31E">
-          <v:rect id="_x0000_i1063" style="width:468pt;height:.85pt" o:hralign="center" o:hrstd="t" o:hr="t" fillcolor="#a0a0a0" stroked="f"/>
         </w:pict>
       </w:r>
     </w:p>
@@ -30745,39 +30800,12 @@
   </w:num>
   <w:num w:numId="45" w16cid:durableId="1194540939">
     <w:abstractNumId w:val="10"/>
-    <w:lvlOverride w:ilvl="0"/>
-    <w:lvlOverride w:ilvl="1"/>
-    <w:lvlOverride w:ilvl="2"/>
-    <w:lvlOverride w:ilvl="3"/>
-    <w:lvlOverride w:ilvl="4"/>
-    <w:lvlOverride w:ilvl="5"/>
-    <w:lvlOverride w:ilvl="6"/>
-    <w:lvlOverride w:ilvl="7"/>
-    <w:lvlOverride w:ilvl="8"/>
   </w:num>
   <w:num w:numId="46" w16cid:durableId="281420939">
     <w:abstractNumId w:val="11"/>
-    <w:lvlOverride w:ilvl="0"/>
-    <w:lvlOverride w:ilvl="1"/>
-    <w:lvlOverride w:ilvl="2"/>
-    <w:lvlOverride w:ilvl="3"/>
-    <w:lvlOverride w:ilvl="4"/>
-    <w:lvlOverride w:ilvl="5"/>
-    <w:lvlOverride w:ilvl="6"/>
-    <w:lvlOverride w:ilvl="7"/>
-    <w:lvlOverride w:ilvl="8"/>
   </w:num>
   <w:num w:numId="47" w16cid:durableId="349139495">
     <w:abstractNumId w:val="12"/>
-    <w:lvlOverride w:ilvl="0"/>
-    <w:lvlOverride w:ilvl="1"/>
-    <w:lvlOverride w:ilvl="2"/>
-    <w:lvlOverride w:ilvl="3"/>
-    <w:lvlOverride w:ilvl="4"/>
-    <w:lvlOverride w:ilvl="5"/>
-    <w:lvlOverride w:ilvl="6"/>
-    <w:lvlOverride w:ilvl="7"/>
-    <w:lvlOverride w:ilvl="8"/>
   </w:num>
   <w:num w:numId="48" w16cid:durableId="560016513">
     <w:abstractNumId w:val="6"/>
@@ -31391,6 +31419,7 @@
   <w:style w:type="character" w:default="1" w:styleId="DefaultParagraphFont">
     <w:name w:val="Default Paragraph Font"/>
     <w:uiPriority w:val="1"/>
+    <w:semiHidden/>
     <w:unhideWhenUsed/>
   </w:style>
   <w:style w:type="table" w:default="1" w:styleId="TableNormal">

</xml_diff>